<commit_message>
Update Portuguese Bible reference texts and metadata for 2026-06-01 release
</commit_message>
<xml_diff>
--- a/por/docx/45.content.docx
+++ b/por/docx/45.content.docx
@@ -214,7 +214,7 @@
         <w:rPr>
           <w:lang w:val="pt_PT" w:bidi="pt_PT"/>
         </w:rPr>
-        <w:t xml:space="preserve"> Paulo, escravo de Cristo Jesus, chamado para ser apóstolo e separado para anunciar o evangelho de Deus,</w:t>
+        <w:t xml:space="preserve"> Paulo, servo de Cristo Jesus, chamado para ser apóstolo e separado para anunciar o evangelho de Deus,</w:t>
       </w:r>
     </w:p>
     <w:p>
@@ -277,7 +277,7 @@
         <w:rPr>
           <w:lang w:val="pt_PT" w:bidi="pt_PT"/>
         </w:rPr>
-        <w:t xml:space="preserve"> e, segundo o Espírito de santidade, foi declarado Filho de Deus com poder, pela ressurreição dentre os mortos: Jesus Cristo, nosso Senhor.</w:t>
+        <w:t xml:space="preserve"> e, segundo o Espírito de santidade, declarado Filho de Deus com poder, pela ressurreição dentre os mortos: Jesus Cristo, nosso Senhor.</w:t>
       </w:r>
     </w:p>
     <w:p>
@@ -298,7 +298,7 @@
         <w:rPr>
           <w:lang w:val="pt_PT" w:bidi="pt_PT"/>
         </w:rPr>
-        <w:t xml:space="preserve"> Por meio dele recebemos graça e apostolado por causa de seu nome, para a obediência da fé, entre todos os gentios.</w:t>
+        <w:t xml:space="preserve"> Por meio dele recebemos graça e apostolado para conduzir todas as nações à obediência da fé por causa do nome dele.</w:t>
       </w:r>
     </w:p>
     <w:p>
@@ -319,7 +319,7 @@
         <w:rPr>
           <w:lang w:val="pt_PT" w:bidi="pt_PT"/>
         </w:rPr>
-        <w:t xml:space="preserve"> Entre os quais vocês também foram chamados para pertencer a Jesus Cristo.</w:t>
+        <w:t xml:space="preserve"> E vocês também estão entre os chamados para pertencer a Jesus Cristo.</w:t>
       </w:r>
     </w:p>
     <w:p>
@@ -361,7 +361,7 @@
         <w:rPr>
           <w:lang w:val="pt_PT" w:bidi="pt_PT"/>
         </w:rPr>
-        <w:t xml:space="preserve"> Primeiro, agradeço ao meu Deus, por meio de Jesus Cristo, por todos vocês, pois a fé que vocês têm é anunciada em todo o mundo.</w:t>
+        <w:t xml:space="preserve"> Antes de tudo, agradeço ao meu Deus, por meio de Jesus Cristo, por todos vocês, porque a fé de vocês é anunciada no mundo inteiro.</w:t>
       </w:r>
     </w:p>
     <w:p>
@@ -382,7 +382,7 @@
         <w:rPr>
           <w:lang w:val="pt_PT" w:bidi="pt_PT"/>
         </w:rPr>
-        <w:t xml:space="preserve"> Deus, a quem sirvo em meu espírito, no evangelho de seu Filho, é minha testemunha de que nunca deixo de me lembrar de vocês</w:t>
+        <w:t xml:space="preserve"> Deus, a quem sirvo em meu espírito, no evangelho de seu Filho, é minha testemunha de que nunca deixo de me lembrar de vocês,</w:t>
       </w:r>
     </w:p>
     <w:p>
@@ -403,7 +403,7 @@
         <w:rPr>
           <w:lang w:val="pt_PT" w:bidi="pt_PT"/>
         </w:rPr>
-        <w:t xml:space="preserve"> em todas as minhas orações, pedindo sempre que, se possível, finalmente, pela vontade de Deus, me seja aberto o caminho para vê-los.</w:t>
+        <w:t xml:space="preserve"> sempre pedindo em minhas orações que, pela vontade de Deus, finalmente eu consiga ir visitá-los.</w:t>
       </w:r>
     </w:p>
     <w:p>
@@ -424,7 +424,7 @@
         <w:rPr>
           <w:lang w:val="pt_PT" w:bidi="pt_PT"/>
         </w:rPr>
-        <w:t xml:space="preserve"> Quero muito visitá-los, a fim de repartir com vocês algum dom espiritual para fortalecê-los,</w:t>
+        <w:t xml:space="preserve"> Desejo muito vê-los para compartilhar com vocês algum dom espiritual, a fim de fortalecê-los;</w:t>
       </w:r>
     </w:p>
     <w:p>
@@ -445,7 +445,7 @@
         <w:rPr>
           <w:lang w:val="pt_PT" w:bidi="pt_PT"/>
         </w:rPr>
-        <w:t xml:space="preserve"> quer dizer, para que sejamos mutuamente consolados por meio da fé.</w:t>
+        <w:t xml:space="preserve"> isto é, para que sejamos encorajados mutuamente pela fé que temos em comum.</w:t>
       </w:r>
     </w:p>
     <w:p>
@@ -466,7 +466,7 @@
         <w:rPr>
           <w:lang w:val="pt_PT" w:bidi="pt_PT"/>
         </w:rPr>
-        <w:t xml:space="preserve"> Irmãos, quero que saibam que muitas vezes me propus a ir vê-los — mas fui impedido até agora — para colher algum fruto também entre vocês, assim como tenho colhido entre os outros gentios.</w:t>
+        <w:t xml:space="preserve"> Irmãos, quero que saibam que muitas vezes planejei visitá-los, mas sempre surgiu algo que me impediu. Ainda assim, mantenho o desejo de servir entre vocês e colher frutos espirituais, assim como já vi entre outros povos gentios.</w:t>
       </w:r>
     </w:p>
     <w:p>
@@ -487,7 +487,7 @@
         <w:rPr>
           <w:lang w:val="pt_PT" w:bidi="pt_PT"/>
         </w:rPr>
-        <w:t xml:space="preserve"> Devo tanto a gregos como a bárbaros, tanto a sábios como a insensatos.</w:t>
+        <w:t xml:space="preserve"> Tenho obrigação tanto para com gregos como para com bárbaros, tanto para com sábios como para com ignorantes.</w:t>
       </w:r>
     </w:p>
     <w:p>
@@ -529,7 +529,7 @@
         <w:rPr>
           <w:lang w:val="pt_PT" w:bidi="pt_PT"/>
         </w:rPr>
-        <w:t xml:space="preserve"> Não me envergonho do evangelho, porque é o poder de Deus para a salvação de todos os que creem, primeiro os judeus e também os gregos.</w:t>
+        <w:t xml:space="preserve"> Não me envergonho do evangelho, porque é o poder de Deus para a salvação de todos os que creem, primeiro os judeus, mas agora também os gregos.</w:t>
       </w:r>
     </w:p>
     <w:p>
@@ -550,7 +550,7 @@
         <w:rPr>
           <w:lang w:val="pt_PT" w:bidi="pt_PT"/>
         </w:rPr>
-        <w:t xml:space="preserve"> Pois o evangelho revela a justiça de Deus, de fé em fé, como está escrito: "O justo viverá pela fé".</w:t>
+        <w:t xml:space="preserve"> Pois no evangelho a justiça de Deus é revelada por meio da fé e para a fé, como está escrito: "O justo viverá pela fé".</w:t>
       </w:r>
     </w:p>
     <w:p>
@@ -571,7 +571,7 @@
         <w:rPr>
           <w:lang w:val="pt_PT" w:bidi="pt_PT"/>
         </w:rPr>
-        <w:t xml:space="preserve"> Assim, a ira de Deus se revela do céu contra toda impiedade e injustiça dos homens que detêm a verdade por meio da injustiça.</w:t>
+        <w:t xml:space="preserve"> Assim, a ira de Deus se revela do céu contra toda impiedade e contra toda injustiça. Ela vem sobre aqueles que praticam injustiça e, por essa injustiça, impedem que a verdade seja conhecida.</w:t>
       </w:r>
     </w:p>
     <w:p>
@@ -592,7 +592,7 @@
         <w:rPr>
           <w:lang w:val="pt_PT" w:bidi="pt_PT"/>
         </w:rPr>
-        <w:t xml:space="preserve"> Porque o que de Deus se pode conhecer se manifesta entre eles, pois Deus lhes manifestou.</w:t>
+        <w:t xml:space="preserve"> Porque aquilo que pode ser conhecido sobre Deus é evidente para eles, pois o próprio Deus lhes tornou isso evidente.</w:t>
       </w:r>
     </w:p>
     <w:p>
@@ -613,7 +613,7 @@
         <w:rPr>
           <w:lang w:val="pt_PT" w:bidi="pt_PT"/>
         </w:rPr>
-        <w:t xml:space="preserve"> Pois, desde a criação do mundo se percebem claramente os atributos invisíveis de Deus, isto é, seu eterno poder e sua divindade, sendo compreendidos por meio das coisas criadas, de modo que esses homens não tenham desculpa alguma.</w:t>
+        <w:t xml:space="preserve"> Pois, desde a criação do mundo se percebem claramente os atributos invisíveis de Deus, isto é, seu eterno poder e sua divindade, sendo compreendidos por meio das coisas criadas. Assim, eles ficam sem desculpa.</w:t>
       </w:r>
     </w:p>
     <w:p>
@@ -634,7 +634,7 @@
         <w:rPr>
           <w:lang w:val="pt_PT" w:bidi="pt_PT"/>
         </w:rPr>
-        <w:t xml:space="preserve"> Porque, embora conhecessem a Deus, não o glorificaram como Deus, nem lhe agradeceram, mas se tornaram inúteis em seus pensamentos, e seu coração insensato se obscureceu.</w:t>
+        <w:t xml:space="preserve"> Porque, embora conhecessem a Deus, não o glorificaram como Deus, nem lhe agradeceram, mas se perderam em seus raciocínios vazios, e o coração sem entendimento deles foi coberto pelas trevas.</w:t>
       </w:r>
     </w:p>
     <w:p>
@@ -676,7 +676,7 @@
         <w:rPr>
           <w:lang w:val="pt_PT" w:bidi="pt_PT"/>
         </w:rPr>
-        <w:t xml:space="preserve"> e trocaram a glória do Deus incorruptível pela imagem de seres semelhantes ao homem corruptível, às aves, aos quadrúpedes e aos répteis.</w:t>
+        <w:t xml:space="preserve"> e trocaram a glória do Deus incorruptível por imagens parecidas com seres humanos mortais, aves, animais de quatro patas e répteis.</w:t>
       </w:r>
     </w:p>
     <w:p>
@@ -697,7 +697,7 @@
         <w:rPr>
           <w:lang w:val="pt_PT" w:bidi="pt_PT"/>
         </w:rPr>
-        <w:t xml:space="preserve"> Por isso, Deus os entregou à imundícia, segundo os desejos do coração deles, para desonrarem seu corpo uns com os outros.</w:t>
+        <w:t xml:space="preserve"> Por isso, Deus os entregou à impureza dos desejos do coração deles, para desonrarem o próprio corpo entre si.</w:t>
       </w:r>
     </w:p>
     <w:p>
@@ -739,7 +739,7 @@
         <w:rPr>
           <w:lang w:val="pt_PT" w:bidi="pt_PT"/>
         </w:rPr>
-        <w:t xml:space="preserve"> Por isso, Deus os entregou a desejos vergonhosos. Até mesmo suas mulheres trocaram a forma natural de suas relações sexuais por outra, contrária à natureza.</w:t>
+        <w:t xml:space="preserve"> Por isso, Deus os entregou a desejos vergonhosos. Até as mulheres trocaram as relações naturais por outras contrárias à natureza.</w:t>
       </w:r>
     </w:p>
     <w:p>
@@ -760,7 +760,7 @@
         <w:rPr>
           <w:lang w:val="pt_PT" w:bidi="pt_PT"/>
         </w:rPr>
-        <w:t xml:space="preserve"> Da mesma forma, também os homens, deixando as relações naturais com as mulheres, foram consumidos pelo desejo mútuo de uns pelos outros, praticando atos vergonhosos com outros homens e recebendo em si mesmos o castigo que convinha ao seu erro.</w:t>
+        <w:t xml:space="preserve"> Da mesma forma, os homens abandonaram as relações naturais com as mulheres e se inflamaram de desejo uns pelos outros, cometendo atos vergonhosos entre si e recebendo em si mesmos a consequência merecida do seu erro.</w:t>
       </w:r>
     </w:p>
     <w:p>
@@ -781,7 +781,7 @@
         <w:rPr>
           <w:lang w:val="pt_PT" w:bidi="pt_PT"/>
         </w:rPr>
-        <w:t xml:space="preserve"> E, visto que não se importaram em ter conhecimento de Deus, ele os entregou a um modo de pensar reprovado para fazerem o que não convém.</w:t>
+        <w:t xml:space="preserve"> E, visto que não se importaram em ter conhecimento de Deus, ele os entregou a uma mente corrompida, para praticarem o que não convém.</w:t>
       </w:r>
     </w:p>
     <w:p>
@@ -865,7 +865,7 @@
         <w:rPr>
           <w:lang w:val="pt_PT" w:bidi="pt_PT"/>
         </w:rPr>
-        <w:t xml:space="preserve"> Embora conheçam o justo decreto de Deus — de que são dignos de morte os que praticam essas coisas —, não somente as fazem, mas também aprovam quem as pratica.</w:t>
+        <w:t xml:space="preserve"> Embora conheçam o decreto de Deus, de que aqueles que praticam essas coisas merecem a morte, não apenas continuam a fazê-las, mas também aprovam os que as praticam.</w:t>
       </w:r>
     </w:p>
     <w:p>
@@ -923,7 +923,7 @@
         <w:rPr>
           <w:lang w:val="pt_PT" w:bidi="pt_PT"/>
         </w:rPr>
-        <w:t xml:space="preserve"> Sabemos que o juízo de Deus contra os que praticam essas coisas é segundo a verdade.</w:t>
+        <w:t xml:space="preserve"> Sabemos que o juízo de Deus contra os que praticam essas coisas está de acordo com a verdade.</w:t>
       </w:r>
     </w:p>
     <w:p>
@@ -1007,7 +1007,7 @@
         <w:rPr>
           <w:lang w:val="pt_PT" w:bidi="pt_PT"/>
         </w:rPr>
-        <w:t xml:space="preserve"> que dará a cada um conforme as suas obras:</w:t>
+        <w:t xml:space="preserve"> que retribuirá a cada um segundo as suas obras:</w:t>
       </w:r>
     </w:p>
     <w:p>
@@ -1028,7 +1028,7 @@
         <w:rPr>
           <w:lang w:val="pt_PT" w:bidi="pt_PT"/>
         </w:rPr>
-        <w:t xml:space="preserve"> a vida eterna àqueles que, perseverando em fazer o bem, buscam glória, honra e imortalidade;</w:t>
+        <w:t xml:space="preserve"> vida eterna aos que, com perseverança em fazer o bem, buscam glória, honra e imortalidade;</w:t>
       </w:r>
     </w:p>
     <w:p>
@@ -1049,7 +1049,7 @@
         <w:rPr>
           <w:lang w:val="pt_PT" w:bidi="pt_PT"/>
         </w:rPr>
-        <w:t xml:space="preserve"> mas ira e indignação àqueles que são egoístas, que desobedecem à verdade e obedecem à injustiça.</w:t>
+        <w:t xml:space="preserve"> mas ira e indignação aos que são egoístas, desobedecem à verdade e obedecem à injustiça.</w:t>
       </w:r>
     </w:p>
     <w:p>
@@ -1070,7 +1070,7 @@
         <w:rPr>
           <w:lang w:val="pt_PT" w:bidi="pt_PT"/>
         </w:rPr>
-        <w:t xml:space="preserve"> Haverá tribulação e angústia sobre a alma de qualquer homem que pratica o mal; primeiro para o judeu e também para o grego;</w:t>
+        <w:t xml:space="preserve"> Haverá tribulação e angústia para todo ser humano que pratica o mal; primeiro para o judeu, depois para o grego;</w:t>
       </w:r>
     </w:p>
     <w:p>
@@ -1091,7 +1091,7 @@
         <w:rPr>
           <w:lang w:val="pt_PT" w:bidi="pt_PT"/>
         </w:rPr>
-        <w:t xml:space="preserve"> mas haverá glória, honra e paz para todo aquele que pratica o bem; primeiro para o judeu e também para o grego.</w:t>
+        <w:t xml:space="preserve"> mas glória, honra e paz para todo aquele que pratica o bem; primeiro para o judeu, depois para o grego.</w:t>
       </w:r>
     </w:p>
     <w:p>
@@ -1154,7 +1154,7 @@
         <w:rPr>
           <w:lang w:val="pt_PT" w:bidi="pt_PT"/>
         </w:rPr>
-        <w:t xml:space="preserve"> Porque os que apenas ouvem a lei não são justos diante de Deus, mas os que a praticam serão declarados justos.</w:t>
+        <w:t xml:space="preserve"> Pois não é quem apenas ouve a lei que se torna justo diante de Deus. Mas quem pratica a lei, esse será declarado justo.</w:t>
       </w:r>
     </w:p>
     <w:p>
@@ -1196,7 +1196,7 @@
         <w:rPr>
           <w:lang w:val="pt_PT" w:bidi="pt_PT"/>
         </w:rPr>
-        <w:t xml:space="preserve"> Mostram a obra da lei gravada em seu coração, pois sua consciência dá testemunho disso, e seus pensamentos, ora os acusam, ora os defendem.</w:t>
+        <w:t xml:space="preserve"> Eles mostram que a exigência da lei está escrita em seu coração, enquanto a consciência deles também dá testemunho disso, e seus pensamentos ora os acusam, ora os defendem.</w:t>
       </w:r>
     </w:p>
     <w:p>
@@ -1217,7 +1217,7 @@
         <w:rPr>
           <w:lang w:val="pt_PT" w:bidi="pt_PT"/>
         </w:rPr>
-        <w:t xml:space="preserve"> Isso se confirmará no dia em que Deus, por meio de Cristo Jesus, julgar os segredos das pessoas, conforme o evangelho que anuncio.</w:t>
+        <w:t xml:space="preserve"> Isso acontecerá no dia em que Deus, por meio de Cristo Jesus, julgar os segredos das pessoas, conforme o evangelho que anuncio.</w:t>
       </w:r>
     </w:p>
     <w:p>
@@ -1343,7 +1343,7 @@
         <w:rPr>
           <w:lang w:val="pt_PT" w:bidi="pt_PT"/>
         </w:rPr>
-        <w:t xml:space="preserve"> Você, que diz que não se deve adulterar, adultera? Você, que abomina os ídolos, rouba os templos?</w:t>
+        <w:t xml:space="preserve"> Você, que diz que não se deve adulterar, adultera? Você, que abomina ídolos, rouba os templos?</w:t>
       </w:r>
     </w:p>
     <w:p>
@@ -1406,7 +1406,7 @@
         <w:rPr>
           <w:lang w:val="pt_PT" w:bidi="pt_PT"/>
         </w:rPr>
-        <w:t xml:space="preserve"> A circuncisão é, na verdade, útil se você observa a lei; mas, se você desobedece à lei, sua circuncisão já se tornou incircuncisão.</w:t>
+        <w:t xml:space="preserve"> A circuncisão é, na verdade, útil se você observa a lei; mas, se você desobedece à lei, sua circuncisão se tornou como incircuncisão.</w:t>
       </w:r>
     </w:p>
     <w:p>
@@ -1427,7 +1427,7 @@
         <w:rPr>
           <w:lang w:val="pt_PT" w:bidi="pt_PT"/>
         </w:rPr>
-        <w:t xml:space="preserve"> Logo, se a incircuncisão observar os preceitos da lei, não será considerada circuncisão?</w:t>
+        <w:t xml:space="preserve"> Logo, se a incircuncisão observar as exigências da lei, não será considerada circuncisão?</w:t>
       </w:r>
     </w:p>
     <w:p>
@@ -1448,7 +1448,7 @@
         <w:rPr>
           <w:lang w:val="pt_PT" w:bidi="pt_PT"/>
         </w:rPr>
-        <w:t xml:space="preserve"> O que é incircunciso por natureza, obedecendo à lei, julgará você, que, com a letra da lei e a circuncisão, não transgride a lei.</w:t>
+        <w:t xml:space="preserve"> E aquele que é incircunciso por natureza, mas cumpre a lei, julgará você, que, mesmo tendo a letra da lei e a circuncisão, a transgride.</w:t>
       </w:r>
     </w:p>
     <w:p>
@@ -1490,7 +1490,7 @@
         <w:rPr>
           <w:lang w:val="pt_PT" w:bidi="pt_PT"/>
         </w:rPr>
-        <w:t xml:space="preserve"> Mas judeu é quem o é no íntimo, e circuncisão é a do coração, operada pelo Espírito, não pela letra da lei, cujo louvor não vem de homens, mas de Deus.</w:t>
+        <w:t xml:space="preserve"> Mas judeu é aquele que o é no interior, e verdadeira circuncisão é a do coração, pelo Espírito, não pela letra; o seu louvor não vem dos homens, mas de Deus.</w:t>
       </w:r>
     </w:p>
     <w:p>
@@ -1590,7 +1590,7 @@
         <w:rPr>
           <w:lang w:val="pt_PT" w:bidi="pt_PT"/>
         </w:rPr>
-        <w:t xml:space="preserve"> De modo algum! Seja Deus verdadeiro, e todo homem, mentiroso, como está escrito: "Para que sejas justificado em tuas palavras e venças quando fores julgado".</w:t>
+        <w:t xml:space="preserve"> De modo algum! Seja Deus verdadeiro, e todo homem, mentiroso, como está escrito: "Para que sejas considerado justo em tuas palavras e venças quando fores julgado".</w:t>
       </w:r>
     </w:p>
     <w:p>
@@ -1611,7 +1611,7 @@
         <w:rPr>
           <w:lang w:val="pt_PT" w:bidi="pt_PT"/>
         </w:rPr>
-        <w:t xml:space="preserve"> E, se nossa injustiça evidencia a justiça de Deus, que diremos? Deus seria injusto por trazer sua ira sobre nós? (Estou seguindo um argumento humano.)</w:t>
+        <w:t xml:space="preserve"> E, se nossa injustiça evidencia a justiça de Deus, o que diremos? Deus seria injusto por trazer sua ira sobre nós? (Estou falando como homem.)</w:t>
       </w:r>
     </w:p>
     <w:p>
@@ -1674,7 +1674,7 @@
         <w:rPr>
           <w:lang w:val="pt_PT" w:bidi="pt_PT"/>
         </w:rPr>
-        <w:t xml:space="preserve"> E por que não dizemos, como alguns caluniosamente alegam que dizemos: "Façamos o mal para que obtenhamos o bem"? A condenação deles é justa.</w:t>
+        <w:t xml:space="preserve"> E por que não dizemos, como alguns caluniosamente alegam que dizemos: "Façamos o mal para que obtenhamos o bem"? Esses tais serão justamente condenados.</w:t>
       </w:r>
     </w:p>
     <w:p>
@@ -1695,7 +1695,7 @@
         <w:rPr>
           <w:lang w:val="pt_PT" w:bidi="pt_PT"/>
         </w:rPr>
-        <w:t xml:space="preserve"> Que diremos, pois? Somos melhores do que eles? De modo algum! Pois já demonstramos que todos, tanto judeus como gregos, estão debaixo do pecado.</w:t>
+        <w:t xml:space="preserve"> O que diremos? Temos alguma vantagem? De forma alguma! Pois já demonstramos que todos, tanto judeus como gregos, estão debaixo do pecado.</w:t>
       </w:r>
     </w:p>
     <w:p>
@@ -1779,7 +1779,7 @@
         <w:rPr>
           <w:lang w:val="pt_PT" w:bidi="pt_PT"/>
         </w:rPr>
-        <w:t xml:space="preserve"> A garganta deles é um túmulo aberto; com a língua enganam, veneno de víboras está em seus lábios.</w:t>
+        <w:t xml:space="preserve"> A garganta deles é um túmulo aberto; com a língua enganam; há veneno de víbora em seus lábios.</w:t>
       </w:r>
     </w:p>
     <w:p>
@@ -1800,7 +1800,7 @@
         <w:rPr>
           <w:lang w:val="pt_PT" w:bidi="pt_PT"/>
         </w:rPr>
-        <w:t xml:space="preserve"> Têm a boca cheia de maldição e amargura.</w:t>
+        <w:t xml:space="preserve"> Sua boca está cheia de maldição e amargura.</w:t>
       </w:r>
     </w:p>
     <w:p>
@@ -1926,7 +1926,7 @@
         <w:rPr>
           <w:lang w:val="pt_PT" w:bidi="pt_PT"/>
         </w:rPr>
-        <w:t xml:space="preserve"> Portanto, ninguém será justificado diante dele por obras da lei, pois é por meio dela que vem o conhecimento do pecado.</w:t>
+        <w:t xml:space="preserve"> Portanto, ninguém será justificado diante dele por obras da lei, pois é por meio da lei que vem o conhecimento do pecado.</w:t>
       </w:r>
     </w:p>
     <w:p>
@@ -1947,7 +1947,7 @@
         <w:rPr>
           <w:lang w:val="pt_PT" w:bidi="pt_PT"/>
         </w:rPr>
-        <w:t xml:space="preserve"> Mas agora, sem a lei, se manifestou a justiça de Deus, atestada pela Lei e pelos Profetas.</w:t>
+        <w:t xml:space="preserve"> Mas agora se tornou visível uma justiça que vem de Deus e não depende da lei. Sobre essa justiça dão testemunho tanto a Lei de Moisés quanto os Profetas.</w:t>
       </w:r>
     </w:p>
     <w:p>
@@ -1968,7 +1968,7 @@
         <w:rPr>
           <w:lang w:val="pt_PT" w:bidi="pt_PT"/>
         </w:rPr>
-        <w:t xml:space="preserve"> Isto é, a justiça de Deus, pela fé em Jesus Cristo, é para todos os que creem. Não há distinção,</w:t>
+        <w:t xml:space="preserve"> Ou seja, a justiça de Deus por meio da fé em Jesus Cristo é para todos os que creem. Não há distinção,</w:t>
       </w:r>
     </w:p>
     <w:p>
@@ -2010,7 +2010,7 @@
         <w:rPr>
           <w:lang w:val="pt_PT" w:bidi="pt_PT"/>
         </w:rPr>
-        <w:t xml:space="preserve"> sendo justificados de forma gratuita por sua graça, mediante a redenção que há em Cristo Jesus,</w:t>
+        <w:t xml:space="preserve"> sendo justificados de forma gratuita pela sua graça, mediante a redenção que há em Cristo Jesus,</w:t>
       </w:r>
     </w:p>
     <w:p>
@@ -2031,7 +2031,7 @@
         <w:rPr>
           <w:lang w:val="pt_PT" w:bidi="pt_PT"/>
         </w:rPr>
-        <w:t xml:space="preserve"> a quem Deus ofereceu como propiciação, mediante a fé em seu sangue, para demonstrar sua justiça por ter deixado impunes os pecados anteriormente cometidos em sua tolerância;</w:t>
+        <w:t xml:space="preserve"> a quem Deus ofereceu como sacrifício expiatório, mediante a fé em seu sangue, para demonstrar sua justiça por ter deixado impunes os pecados anteriormente cometidos em sua tolerância;</w:t>
       </w:r>
     </w:p>
     <w:p>
@@ -2052,7 +2052,7 @@
         <w:rPr>
           <w:lang w:val="pt_PT" w:bidi="pt_PT"/>
         </w:rPr>
-        <w:t xml:space="preserve"> a fim de demonstrar sua justiça no tempo presente, para que seja justo e o justificador de quem tem fé em Jesus.</w:t>
+        <w:t xml:space="preserve"> a fim de demonstrar sua justiça no tempo presente, para ser justo e também justificar aquele que tem fé em Jesus.</w:t>
       </w:r>
     </w:p>
     <w:p>
@@ -2073,7 +2073,7 @@
         <w:rPr>
           <w:lang w:val="pt_PT" w:bidi="pt_PT"/>
         </w:rPr>
-        <w:t xml:space="preserve"> Onde, então, está o motivo de vanglória? Está excluído! Por qual lei? Não pela lei das obras, mas pela lei da fé.</w:t>
+        <w:t xml:space="preserve"> Onde está, então, a glória pessoal? Foi excluída! Por qual lei? Não pela lei das obras, mas pela lei da fé.</w:t>
       </w:r>
     </w:p>
     <w:p>
@@ -2094,7 +2094,7 @@
         <w:rPr>
           <w:lang w:val="pt_PT" w:bidi="pt_PT"/>
         </w:rPr>
-        <w:t xml:space="preserve"> Concluímos, pois, que o homem é justificado pela fé, à parte das obras da lei.</w:t>
+        <w:t xml:space="preserve"> Concluímos, pois, que o ser humano é justificado pela fé, independentemente das obras da lei.</w:t>
       </w:r>
     </w:p>
     <w:p>
@@ -2115,7 +2115,7 @@
         <w:rPr>
           <w:lang w:val="pt_PT" w:bidi="pt_PT"/>
         </w:rPr>
-        <w:t xml:space="preserve"> Ou Deus é somente dos judeus? Não é também dos gentios? Sim, também dos gentios,</w:t>
+        <w:t xml:space="preserve"> Ou Deus é apenas dos judeus? Ele não é também dos gentios? Sim, também dos gentios,</w:t>
       </w:r>
     </w:p>
     <w:p>
@@ -2157,7 +2157,7 @@
         <w:rPr>
           <w:lang w:val="pt_PT" w:bidi="pt_PT"/>
         </w:rPr>
-        <w:t xml:space="preserve"> Anulamos, então, a lei pela fé? De maneira alguma! Pelo contrário, estabelecemos a lei.</w:t>
+        <w:t xml:space="preserve"> Anulamos, então, a lei pela fé? De modo nenhum! Pelo contrário, confirmamos a lei.</w:t>
       </w:r>
     </w:p>
     <w:p>
@@ -2257,7 +2257,7 @@
         <w:rPr>
           <w:lang w:val="pt_PT" w:bidi="pt_PT"/>
         </w:rPr>
-        <w:t xml:space="preserve"> O salário do trabalhador não é considerado favor, mas o que lhe é devido;</w:t>
+        <w:t xml:space="preserve"> O salário do trabalhador não é considerado favor, mas o que lhe é devido.</w:t>
       </w:r>
     </w:p>
     <w:p>
@@ -2278,7 +2278,7 @@
         <w:rPr>
           <w:lang w:val="pt_PT" w:bidi="pt_PT"/>
         </w:rPr>
-        <w:t xml:space="preserve"> contudo, para quem não trabalha, mas crê naquele que justifica o ímpio, sua fé lhe é imputada como justiça.</w:t>
+        <w:t xml:space="preserve"> Contudo, para quem não trabalha, mas crê naquele que justifica o ímpio, sua fé é contada como justiça.</w:t>
       </w:r>
     </w:p>
     <w:p>
@@ -2320,7 +2320,7 @@
         <w:rPr>
           <w:lang w:val="pt_PT" w:bidi="pt_PT"/>
         </w:rPr>
-        <w:t xml:space="preserve"> "Bem-aventurados são aqueles cujas transgressões são perdoadas e cujos pecados são cobertos;</w:t>
+        <w:t xml:space="preserve"> "Bem-aventurados são aqueles cujas transgressões são perdoadas e cujos pecados são apagados;</w:t>
       </w:r>
     </w:p>
     <w:p>
@@ -2362,7 +2362,7 @@
         <w:rPr>
           <w:lang w:val="pt_PT" w:bidi="pt_PT"/>
         </w:rPr>
-        <w:t xml:space="preserve"> Essa bem-aventurança se destina aos circuncisos ou também aos incircuncisos? Pois dizemos: "A fé foi imputada a Abraão como justiça".</w:t>
+        <w:t xml:space="preserve"> Essa bem-aventurança é apenas para os circuncisos, ou também para os incircuncisos? Pois dizemos: "A fé foi imputada a Abraão como justiça".</w:t>
       </w:r>
     </w:p>
     <w:p>
@@ -2404,7 +2404,7 @@
         <w:rPr>
           <w:lang w:val="pt_PT" w:bidi="pt_PT"/>
         </w:rPr>
-        <w:t xml:space="preserve"> Ele recebeu o sinal da circuncisão, selo da justiça da fé que tinha quando ainda era incircunciso, para que fosse pai de todos os que creem, estando eles incircuncisos, a fim de que a justiça também lhes fosse imputada;</w:t>
+        <w:t xml:space="preserve"> Ele recebeu o sinal da circuncisão como selo da justiça que tinha pela fé quando ainda era incircunciso. Isso para que fosse pai de todos os que creem, mesmo sem circuncisão, a fim de que a justiça também fosse imputada a eles;</w:t>
       </w:r>
     </w:p>
     <w:p>
@@ -2467,7 +2467,7 @@
         <w:rPr>
           <w:lang w:val="pt_PT" w:bidi="pt_PT"/>
         </w:rPr>
-        <w:t xml:space="preserve"> Pois, se aqueles que são da lei são herdeiros, a fé se torna vã e a promessa é anulada.</w:t>
+        <w:t xml:space="preserve"> Pois, se aqueles que são da lei são herdeiros, a fé perde o sentido e a promessa é anulada.</w:t>
       </w:r>
     </w:p>
     <w:p>
@@ -2509,7 +2509,7 @@
         <w:rPr>
           <w:lang w:val="pt_PT" w:bidi="pt_PT"/>
         </w:rPr>
-        <w:t xml:space="preserve"> Por isso, a promessa vem pela fé, para que seja assegurada, pela graça, a todos os descendentes de Abraão, não somente aos que são da lei, mas também aos que têm a fé de Abraão, que é o pai de todos nós.</w:t>
+        <w:t xml:space="preserve"> Por isso a promessa vem pela fé, para que seja garantida pela graça a todos os seus descendentes: não apenas aos que pertencem à lei, mas também aos que têm a fé de Abraão, que é pai de todos nós.</w:t>
       </w:r>
     </w:p>
     <w:p>
@@ -2551,7 +2551,7 @@
         <w:rPr>
           <w:lang w:val="pt_PT" w:bidi="pt_PT"/>
         </w:rPr>
-        <w:t xml:space="preserve"> Abraão, sem ter motivo para ter esperança, a manteve, crendo que se tornaria pai de muitas nações, conforme lhe tinha sido dito: "Assim será a sua descendência".</w:t>
+        <w:t xml:space="preserve"> Contra toda esperança, ele ainda esperou, crendo que se tornaria pai de muitas nações, conforme lhe tinha sido dito: "Assim será a sua descendência".</w:t>
       </w:r>
     </w:p>
     <w:p>
@@ -2572,7 +2572,7 @@
         <w:rPr>
           <w:lang w:val="pt_PT" w:bidi="pt_PT"/>
         </w:rPr>
-        <w:t xml:space="preserve"> Sem enfraquecer na fé, considerou seu próprio corpo, já sem vitalidade, tendo ele quase cem anos, e também o ventre estéril de Sara.</w:t>
+        <w:t xml:space="preserve"> Sem enfraquecer na fé, considerou seu próprio corpo, já como morto, tendo ele quase cem anos, e também o ventre estéril de Sara.</w:t>
       </w:r>
     </w:p>
     <w:p>
@@ -2677,7 +2677,7 @@
         <w:rPr>
           <w:lang w:val="pt_PT" w:bidi="pt_PT"/>
         </w:rPr>
-        <w:t xml:space="preserve"> mas também para nós, a quem igualmente será imputada justiça, a saber, a nós, que cremos naquele que Jesus ressuscitou dentre os mortos a Jesus, nosso Senhor,</w:t>
+        <w:t xml:space="preserve"> mas também para nós, a quem a justiça será imputada, a nós que cremos naquele que ressuscitou Jesus dentre os mortos, nosso Senhor,</w:t>
       </w:r>
     </w:p>
     <w:p>
@@ -2698,7 +2698,7 @@
         <w:rPr>
           <w:lang w:val="pt_PT" w:bidi="pt_PT"/>
         </w:rPr>
-        <w:t xml:space="preserve"> o qual foi entregue à morte por causa de nossas transgressões e ressuscitou para nossa justificação.</w:t>
+        <w:t xml:space="preserve"> o qual foi entregue à morte por causa das nossas transgressões e ressuscitado para a nossa justificação.</w:t>
       </w:r>
     </w:p>
     <w:p>
@@ -2735,7 +2735,7 @@
         <w:rPr>
           <w:lang w:val="pt_PT" w:bidi="pt_PT"/>
         </w:rPr>
-        <w:t xml:space="preserve"> Portanto, uma vez declarados justos pela fé, temos paz com Deus por meio de nosso Senhor Jesus Cristo,</w:t>
+        <w:t xml:space="preserve"> Assim, tendo sido declarados justos pela fé, passamos a viver em paz com Deus por meio de Jesus Cristo, nosso Senhor.</w:t>
       </w:r>
     </w:p>
     <w:p>
@@ -2756,7 +2756,7 @@
         <w:rPr>
           <w:lang w:val="pt_PT" w:bidi="pt_PT"/>
         </w:rPr>
-        <w:t xml:space="preserve"> por meio de quem também temos acesso pela fé a esta graça, na qual estamos firmes, e nos gloriamos na esperança da glória de Deus.</w:t>
+        <w:t xml:space="preserve"> Por meio dele também temos entrada, pela fé, nessa graça em que permanecemos firmes, e nos alegramos na esperança da glória de Deus.</w:t>
       </w:r>
     </w:p>
     <w:p>
@@ -2819,7 +2819,7 @@
         <w:rPr>
           <w:lang w:val="pt_PT" w:bidi="pt_PT"/>
         </w:rPr>
-        <w:t xml:space="preserve"> E a esperança não traz confusão, porque o amor de Deus foi derramado em nosso coração pelo Espírito Santo que nos foi dado.</w:t>
+        <w:t xml:space="preserve"> Essa esperança não decepciona, pois o amor de Deus foi colocado em nosso coração pelo Espírito Santo que nos foi dado.</w:t>
       </w:r>
     </w:p>
     <w:p>
@@ -2903,7 +2903,7 @@
         <w:rPr>
           <w:lang w:val="pt_PT" w:bidi="pt_PT"/>
         </w:rPr>
-        <w:t xml:space="preserve"> Portanto, muito mais agora, justificados por seu sangue, seremos salvos da ira por meio dele!</w:t>
+        <w:t xml:space="preserve"> Agora, sendo declarados justos pelo sangue dele, muito mais seremos livrados da ira por meio de Cristo.</w:t>
       </w:r>
     </w:p>
     <w:p>
@@ -2945,7 +2945,7 @@
         <w:rPr>
           <w:lang w:val="pt_PT" w:bidi="pt_PT"/>
         </w:rPr>
-        <w:t xml:space="preserve"> E não somente isso, mas também nos gloriamos em Deus por meio de nosso Senhor Jesus Cristo, por meio de quem agora recebemos a reconciliação.</w:t>
+        <w:t xml:space="preserve"> E não apenas isso: também nos alegramos em Deus por meio de Jesus Cristo, por quem recebemos agora essa reconciliação.</w:t>
       </w:r>
     </w:p>
     <w:p>
@@ -2966,7 +2966,7 @@
         <w:rPr>
           <w:lang w:val="pt_PT" w:bidi="pt_PT"/>
         </w:rPr>
-        <w:t xml:space="preserve"> Por isso, assim como o pecado entrou no mundo por um homem, e por meio do pecado também a morte, assim a morte passou a todos os homens, porque todos pecaram.</w:t>
+        <w:t xml:space="preserve"> Por isso, assim como o pecado entrou no mundo por meio de um único homem, e com ele a morte, assim também a morte se espalhou entre todos, porque todos pecaram.</w:t>
       </w:r>
     </w:p>
     <w:p>
@@ -3029,7 +3029,7 @@
         <w:rPr>
           <w:lang w:val="pt_PT" w:bidi="pt_PT"/>
         </w:rPr>
-        <w:t xml:space="preserve"> Entretanto, o pecado não é comparável ao dom gratuito. Se pela transgressão de um só muitos morreram, muito mais a graça de Deus e o dom pela graça de um só homem, Jesus Cristo, abundaram sobre muitos.</w:t>
+        <w:t xml:space="preserve"> Contudo, não há comparação entre o dom e a transgressão. Pois, se muitos morreram por causa da transgressão de um só, muito mais a graça de Deus, o dom que vem pela graça de um só homem, Jesus Cristo, transbordou para muitos.</w:t>
       </w:r>
     </w:p>
     <w:p>
@@ -3050,7 +3050,7 @@
         <w:rPr>
           <w:lang w:val="pt_PT" w:bidi="pt_PT"/>
         </w:rPr>
-        <w:t xml:space="preserve"> Não se pode comparar o dom gratuito com o resultado do pecado de um só homem. Porque por um pecado veio o juízo que trouxe condenação, mas o dom gratuito veio de muitos pecados para a justificação.</w:t>
+        <w:t xml:space="preserve"> O dom não se compara ao resultado do pecado de um só homem. Pelo erro de um veio a condenação, mas o dom trouxe, após muitos pecados, uma declaração de justiça.</w:t>
       </w:r>
     </w:p>
     <w:p>
@@ -3071,7 +3071,7 @@
         <w:rPr>
           <w:lang w:val="pt_PT" w:bidi="pt_PT"/>
         </w:rPr>
-        <w:t xml:space="preserve"> Se pela transgressão de um só a morte reinou por meio dele, muito mais os que recebem a abundância da graça e o dom da justiça reinarão em vida por meio de um só, Jesus Cristo.</w:t>
+        <w:t xml:space="preserve"> Se pela transgressão de um só a morte passou a reinar por meio dele, muito mais aqueles que recebem a abundância da graça e o dom da justiça reinarão em vida por meio de Jesus Cristo.</w:t>
       </w:r>
     </w:p>
     <w:p>
@@ -3092,7 +3092,7 @@
         <w:rPr>
           <w:lang w:val="pt_PT" w:bidi="pt_PT"/>
         </w:rPr>
-        <w:t xml:space="preserve"> Assim como por meio de uma só transgressão veio condenação sobre todos os homens, assim também por meio de um só ato de justiça veio sobre todos os homens a justificação que traz vida.</w:t>
+        <w:t xml:space="preserve"> Assim como uma única transgressão trouxe condenação a todos, também um único ato justo trouxe a todos a possibilidade de vida justa.</w:t>
       </w:r>
     </w:p>
     <w:p>
@@ -3134,7 +3134,7 @@
         <w:rPr>
           <w:lang w:val="pt_PT" w:bidi="pt_PT"/>
         </w:rPr>
-        <w:t xml:space="preserve"> A lei, porém, veio para que o pecado abundasse; mas onde o pecado abundou, a graça superabundou,</w:t>
+        <w:t xml:space="preserve"> A lei entrou para que o pecado se tornasse mais evidente; mas onde o pecado cresceu, a graça cresceu ainda mais,</w:t>
       </w:r>
     </w:p>
     <w:p>
@@ -3155,7 +3155,7 @@
         <w:rPr>
           <w:lang w:val="pt_PT" w:bidi="pt_PT"/>
         </w:rPr>
-        <w:t xml:space="preserve"> para que, assim como o pecado reinou na morte, também a graça reine pela justiça que conduz à vida eterna por meio de Jesus Cristo, nosso Senhor.</w:t>
+        <w:t xml:space="preserve"> para que, assim como o pecado reinou trazendo morte, também a graça reine pela justiça, conduzindo à vida eterna por meio de Jesus Cristo, nosso Senhor.</w:t>
       </w:r>
     </w:p>
     <w:p>
@@ -3255,7 +3255,7 @@
         <w:rPr>
           <w:lang w:val="pt_PT" w:bidi="pt_PT"/>
         </w:rPr>
-        <w:t xml:space="preserve"> Portanto, pelo batismo fomos sepultados com ele na morte, para que, do mesmo modo que Cristo foi ressuscitado dos mortos pelo poder glorioso do Pai, também vivamos em uma nova realidade de vida.</w:t>
+        <w:t xml:space="preserve"> Portanto, pelo batismo fomos sepultados com ele na morte, para que, do mesmo modo que Cristo foi ressuscitado dos mortos pelo poder glorioso do Pai, também vivamos numa nova realidade de vida.</w:t>
       </w:r>
     </w:p>
     <w:p>
@@ -3297,7 +3297,7 @@
         <w:rPr>
           <w:lang w:val="pt_PT" w:bidi="pt_PT"/>
         </w:rPr>
-        <w:t xml:space="preserve"> Sabemos que nosso velho homem foi crucificado com ele, para que o corpo dominado pelo pecado seja destruído, e não mais sirvamos ao pecado;</w:t>
+        <w:t xml:space="preserve"> Sabemos que nosso antigo modo de viver foi crucificado com ele, para que o corpo dominado pelo pecado perca seu poder, e assim não sirvamos mais ao pecado;</w:t>
       </w:r>
     </w:p>
     <w:p>
@@ -3318,7 +3318,7 @@
         <w:rPr>
           <w:lang w:val="pt_PT" w:bidi="pt_PT"/>
         </w:rPr>
-        <w:t xml:space="preserve"> pois aquele que morreu foi justificado do pecado.</w:t>
+        <w:t xml:space="preserve"> pois quem morreu já foi libertado do pecado.</w:t>
       </w:r>
     </w:p>
     <w:p>
@@ -3444,7 +3444,7 @@
         <w:rPr>
           <w:lang w:val="pt_PT" w:bidi="pt_PT"/>
         </w:rPr>
-        <w:t xml:space="preserve"> Tampouco ofereçam os membros do corpo ao pecado, como instrumentos de injustiça; mas se apresentem a Deus como quem passou da morte para a vida, e os membros do corpo, como instrumentos de justiça.</w:t>
+        <w:t xml:space="preserve"> Não entreguem partes do corpo ao pecado como ferramentas da injustiça. Ao contrário, apresentem-se a Deus como quem passou da morte para a vida, e ofereçam seus membros como instrumentos de justiça.</w:t>
       </w:r>
     </w:p>
     <w:p>
@@ -3507,7 +3507,7 @@
         <w:rPr>
           <w:lang w:val="pt_PT" w:bidi="pt_PT"/>
         </w:rPr>
-        <w:t xml:space="preserve"> Vocês não sabem que, quando se apresentam como servos para obedecer a alguém, tornam-se servos daquele a quem obedecem — seja do pecado, que conduz à morte, ou da obediência, que leva à justiça?</w:t>
+        <w:t xml:space="preserve"> Vocês não sabem que, quando alguém se coloca como servo para obedecer a outro, torna-se servo daquele a quem obedece? Ou do pecado, que leva à morte, ou da obediência, que leva à justiça?</w:t>
       </w:r>
     </w:p>
     <w:p>
@@ -3570,7 +3570,7 @@
         <w:rPr>
           <w:lang w:val="pt_PT" w:bidi="pt_PT"/>
         </w:rPr>
-        <w:t xml:space="preserve"> Falo como homem, por causa da fraqueza da carne. Assim como vocês apresentaram os membros do corpo como servos da imundície e da iniquidade que leva à iniquidade, assim apresentem agora os membros do corpo como servos da justiça para a santificação.</w:t>
+        <w:t xml:space="preserve"> Falo de forma simples, por causa da limitação humana. Assim como vocês antes entregaram as partes do corpo à impureza e à desordem que levam a mais desordem, agora entreguem essas mesmas partes à justiça, para uma vida separada para Deus.</w:t>
       </w:r>
     </w:p>
     <w:p>
@@ -3633,7 +3633,7 @@
         <w:rPr>
           <w:lang w:val="pt_PT" w:bidi="pt_PT"/>
         </w:rPr>
-        <w:t xml:space="preserve"> Mas agora, livres da escravidão do pecado e feitos servos de Deus, vocês colhem o fruto que conduz à santificação e, por fim, à vida eterna.</w:t>
+        <w:t xml:space="preserve"> Agora, libertados do pecado e feitos servos de Deus, vocês produzem um fruto que leva a uma vida dedicada a Deus, e isso termina na vida eterna.</w:t>
       </w:r>
     </w:p>
     <w:p>
@@ -3654,7 +3654,7 @@
         <w:rPr>
           <w:lang w:val="pt_PT" w:bidi="pt_PT"/>
         </w:rPr>
-        <w:t xml:space="preserve"> Porque o salário do pecado é a morte, mas o dom gratuito de Deus é a vida eterna em Cristo Jesus, nosso Senhor.</w:t>
+        <w:t xml:space="preserve"> O resultado do pecado é a morte, mas o presente de Deus é a vida eterna em Cristo Jesus, nosso Senhor.</w:t>
       </w:r>
     </w:p>
     <w:p>
@@ -3691,7 +3691,7 @@
         <w:rPr>
           <w:lang w:val="pt_PT" w:bidi="pt_PT"/>
         </w:rPr>
-        <w:t xml:space="preserve"> Ou vocês não sabem, irmãos (pois falo a pessoas que conhecem a lei), que a lei tem domínio sobre o homem apenas enquanto ele vive?</w:t>
+        <w:t xml:space="preserve"> Vocês não sabem, irmãos, — falo com pessoas que conhecem a lei — que a lei tem autoridade sobre alguém apenas enquanto essa pessoa está viva?</w:t>
       </w:r>
     </w:p>
     <w:p>
@@ -3754,7 +3754,7 @@
         <w:rPr>
           <w:lang w:val="pt_PT" w:bidi="pt_PT"/>
         </w:rPr>
-        <w:t xml:space="preserve"> Portanto, meus irmãos, vocês também estão mortos para a lei, por meio do corpo de Cristo, para serem de outro, daquele que ressuscitou dentre os mortos, a fim de que produzamos frutos para Deus.</w:t>
+        <w:t xml:space="preserve"> Assim também vocês, meus irmãos, foram colocados como mortos para a lei por meio do corpo de Cristo, para pertencerem a outro, àquele que foi ressuscitado dentre os mortos, a fim de que produzamos frutos para Deus.</w:t>
       </w:r>
     </w:p>
     <w:p>
@@ -3775,7 +3775,7 @@
         <w:rPr>
           <w:lang w:val="pt_PT" w:bidi="pt_PT"/>
         </w:rPr>
-        <w:t xml:space="preserve"> Porque, quando estávamos na carne, as paixões pecaminosas, despertadas pela lei, agiam em nossos membros para produzirem fruto para a morte;</w:t>
+        <w:t xml:space="preserve"> Quando vivíamos segundo a natureza humana, os desejos do pecado, despertados pela lei, agiam em nosso corpo e produziam resultados que levavam à morte.</w:t>
       </w:r>
     </w:p>
     <w:p>
@@ -3796,7 +3796,7 @@
         <w:rPr>
           <w:lang w:val="pt_PT" w:bidi="pt_PT"/>
         </w:rPr>
-        <w:t xml:space="preserve"> Agora, porém, fomos libertados da lei, tendo morrido para aquilo em que estávamos presos, para que sirvamos em novidade do Espírito, e não na velhice da letra.</w:t>
+        <w:t xml:space="preserve"> Agora, porém, fomos libertados da lei, pois morremos para aquilo que antes nos prendia, para servir de um modo novo, guiado pelo Espírito, e não pelo antigo sistema da letra.</w:t>
       </w:r>
     </w:p>
     <w:p>
@@ -3817,7 +3817,7 @@
         <w:rPr>
           <w:lang w:val="pt_PT" w:bidi="pt_PT"/>
         </w:rPr>
-        <w:t xml:space="preserve"> Então, que diremos? A lei é pecado? De maneira alguma! Mas eu não teria conhecido o pecado, a não ser pela lei; pois eu não saberia o que é cobiça, se a lei não dissesse: "Não cobice".</w:t>
+        <w:t xml:space="preserve"> Então o que dizer? A lei é pecado? De forma alguma! Mas eu não teria conhecido o pecado se não fosse pela lei; eu não saberia o que é cobiça se a lei não dissesse: "Não cobice".</w:t>
       </w:r>
     </w:p>
     <w:p>
@@ -3943,7 +3943,7 @@
         <w:rPr>
           <w:lang w:val="pt_PT" w:bidi="pt_PT"/>
         </w:rPr>
-        <w:t xml:space="preserve"> Então, o que é bom se tornou morte para mim? De modo algum! Pelo contrário, o pecado, para se mostrar como tal, operou a morte em mim por meio do que era bom, mostrando, pelo mandamento, como ele é perverso.</w:t>
+        <w:t xml:space="preserve"> Então algo bom acabou se tornando morte para mim? De modo algum! Foi o pecado que, usando o que é bom, produziu morte em mim, para que ele aparecesse claramente como pecado, mostrando sua perversidade por meio do mandamento.</w:t>
       </w:r>
     </w:p>
     <w:p>
@@ -3964,7 +3964,7 @@
         <w:rPr>
           <w:lang w:val="pt_PT" w:bidi="pt_PT"/>
         </w:rPr>
-        <w:t xml:space="preserve"> Sabemos que a lei é espiritual, mas eu sou carnal, pois fui vendido como escravo ao pecado.</w:t>
+        <w:t xml:space="preserve"> Sabemos que a lei vem de Deus, mas eu sou limitado pela natureza humana, vendido como escravo ao pecado.</w:t>
       </w:r>
     </w:p>
     <w:p>
@@ -4153,7 +4153,7 @@
         <w:rPr>
           <w:lang w:val="pt_PT" w:bidi="pt_PT"/>
         </w:rPr>
-        <w:t xml:space="preserve"> mas vejo em meus membros outra lei que, lutando contra a lei de meu entendimento, leva-me cativo à lei do pecado que está em meus membros.</w:t>
+        <w:t xml:space="preserve"> mas vejo em mim outra força em conflito com o que eu entendo, que me prende como cativo à lei do pecado que age em meu corpo.</w:t>
       </w:r>
     </w:p>
     <w:p>
@@ -4174,7 +4174,7 @@
         <w:rPr>
           <w:lang w:val="pt_PT" w:bidi="pt_PT"/>
         </w:rPr>
-        <w:t xml:space="preserve"> Que homem miserável que eu sou! Quem me livrará do corpo desta morte?</w:t>
+        <w:t xml:space="preserve"> Como sou miserável! Quem vai me libertar deste corpo sujeito à morte?</w:t>
       </w:r>
     </w:p>
     <w:p>
@@ -4195,7 +4195,7 @@
         <w:rPr>
           <w:lang w:val="pt_PT" w:bidi="pt_PT"/>
         </w:rPr>
-        <w:t xml:space="preserve"> Graças a Deus por Jesus Cristo, nosso Senhor! Assim, eu mesmo, com o entendimento, sirvo à lei de Deus, mas, com a carne, sirvo à lei do pecado.</w:t>
+        <w:t xml:space="preserve"> Agradeço a Deus por meio de Jesus Cristo, nosso Senhor! Assim, com a mente sirvo à lei de Deus, mas, com minha natureza humana, ainda sirvo à lei do pecado.</w:t>
       </w:r>
     </w:p>
     <w:p>
@@ -4232,7 +4232,7 @@
         <w:rPr>
           <w:lang w:val="pt_PT" w:bidi="pt_PT"/>
         </w:rPr>
-        <w:t xml:space="preserve"> Portanto, agora já não há condenação alguma para os que estão em Cristo Jesus.</w:t>
+        <w:t xml:space="preserve"> Assim, agora não existe mais condenação para os que estão em Cristo Jesus.</w:t>
       </w:r>
     </w:p>
     <w:p>
@@ -4253,7 +4253,7 @@
         <w:rPr>
           <w:lang w:val="pt_PT" w:bidi="pt_PT"/>
         </w:rPr>
-        <w:t xml:space="preserve"> Pois, em Cristo Jesus, a lei do Espírito que dá vida os libertou da lei do pecado e da morte.</w:t>
+        <w:t xml:space="preserve"> Porque, por meio de Cristo Jesus, a lei do Espírito que dá vida me libertou da lei do pecado e da morte.</w:t>
       </w:r>
     </w:p>
     <w:p>
@@ -4274,7 +4274,7 @@
         <w:rPr>
           <w:lang w:val="pt_PT" w:bidi="pt_PT"/>
         </w:rPr>
-        <w:t xml:space="preserve"> O que a lei não podia fazer por estar enfraquecida pela carne, Deus, ao enviar seu próprio Filho em semelhança da carne pecaminosa e como oferta pelo pecado, condenou o pecado na carne,</w:t>
+        <w:t xml:space="preserve"> O que a lei não conseguiu fazer, por causa da fraqueza da natureza humana, Deus fez ao enviar seu próprio Filho em forma humana semelhante à do pecado, como oferta pelo pecado, condenando o pecado na carne.</w:t>
       </w:r>
     </w:p>
     <w:p>
@@ -4295,7 +4295,7 @@
         <w:rPr>
           <w:lang w:val="pt_PT" w:bidi="pt_PT"/>
         </w:rPr>
-        <w:t xml:space="preserve"> a fim de que a justa exigência da lei fosse cumprida em nós, que não andamos segundo a carne, mas segundo o Espírito.</w:t>
+        <w:t xml:space="preserve"> Isso aconteceu para que o que a lei exige fosse cumprido em nós, que não seguimos os caminhos da natureza humana, mas os do Espírito.</w:t>
       </w:r>
     </w:p>
     <w:p>
@@ -4337,7 +4337,7 @@
         <w:rPr>
           <w:lang w:val="pt_PT" w:bidi="pt_PT"/>
         </w:rPr>
-        <w:t xml:space="preserve"> O modo de pensar da carne é morte, mas o do Espírito é vida e paz;</w:t>
+        <w:t xml:space="preserve"> Pensar guiado pela natureza humana leva à morte, mas pensar guiado pelo Espírito leva à vida e à paz.</w:t>
       </w:r>
     </w:p>
     <w:p>
@@ -4358,7 +4358,7 @@
         <w:rPr>
           <w:lang w:val="pt_PT" w:bidi="pt_PT"/>
         </w:rPr>
-        <w:t xml:space="preserve"> visto que o modo de pensar da carne é inimigo de Deus, pois não se submete à lei de Deus, nem pode fazer isso.</w:t>
+        <w:t xml:space="preserve"> Pois o pensamento guiado pela natureza humana é contra Deus; ele não se submete à lei de Deus e nem consegue se submeter.</w:t>
       </w:r>
     </w:p>
     <w:p>
@@ -4379,7 +4379,7 @@
         <w:rPr>
           <w:lang w:val="pt_PT" w:bidi="pt_PT"/>
         </w:rPr>
-        <w:t xml:space="preserve"> Assim, os que vivem segundo a carne não podem agradar a Deus.</w:t>
+        <w:t xml:space="preserve"> Assim, os que vivem de acordo com a natureza humana não podem agradar a Deus.</w:t>
       </w:r>
     </w:p>
     <w:p>
@@ -4400,7 +4400,7 @@
         <w:rPr>
           <w:lang w:val="pt_PT" w:bidi="pt_PT"/>
         </w:rPr>
-        <w:t xml:space="preserve"> Vocês, porém, não vivem segundo a carne, mas segundo o Espírito, se, de fato, o Espírito de Deus habita em vocês. Mas, se alguém não tem o Espírito de Cristo, esse não pertence a ele.</w:t>
+        <w:t xml:space="preserve"> Vocês, porém, não vivem de acordo com a natureza humana, mas segundo o Espírito, se, de fato, o Espírito de Deus habita em vocês. Mas, se alguém não tem o Espírito de Cristo, esse não pertence a ele.</w:t>
       </w:r>
     </w:p>
     <w:p>
@@ -4421,7 +4421,7 @@
         <w:rPr>
           <w:lang w:val="pt_PT" w:bidi="pt_PT"/>
         </w:rPr>
-        <w:t xml:space="preserve"> Mas se Cristo está em vocês, o corpo está morto por causa do pecado, mas o espíritoOu o Espírito." class="footnote-marker"&gt;1 é vida por causa da justiça.</w:t>
+        <w:t xml:space="preserve"> Se Cristo está em vocês, o corpo está sujeito à morte por causa do pecado, mas o espírito1 é vida por causa da justiça.</w:t>
       </w:r>
     </w:p>
     <w:p>
@@ -4442,7 +4442,7 @@
         <w:rPr>
           <w:lang w:val="pt_PT" w:bidi="pt_PT"/>
         </w:rPr>
-        <w:t xml:space="preserve"> E, se habita em vocês o Espírito daquele que ressuscitou Jesus dentre os mortos, esse mesmo que ressuscitou Cristo dentre os mortos também dará vida ao corpo mortal de vocês, por meio de seu Espírito que habita em vocês.</w:t>
+        <w:t xml:space="preserve"> E, se o Espírito daquele que ressuscitou Jesus dentre os mortos habita em vocês, aquele que ressuscitou Cristo dará vida também ao corpo mortal de vocês, por meio do seu Espírito que vive em vocês.</w:t>
       </w:r>
     </w:p>
     <w:p>
@@ -4463,7 +4463,7 @@
         <w:rPr>
           <w:lang w:val="pt_PT" w:bidi="pt_PT"/>
         </w:rPr>
-        <w:t xml:space="preserve"> Portanto, irmãos, temos uma dívida — não com a carne, para que vivamos segundo a carne.</w:t>
+        <w:t xml:space="preserve"> Portanto, irmãos, não temos obrigação com a natureza humana, para vivermos de acordo com ela.</w:t>
       </w:r>
     </w:p>
     <w:p>
@@ -4484,7 +4484,7 @@
         <w:rPr>
           <w:lang w:val="pt_PT" w:bidi="pt_PT"/>
         </w:rPr>
-        <w:t xml:space="preserve"> Se vocês viverem segundo a carne, morrerão; mas, se pelo Espírito matarem as obras do corpo, vocês viverão.</w:t>
+        <w:t xml:space="preserve"> Se vocês viverem de acordo com a natureza humana, morrerão; mas, se pelo Espírito fizerem morrer as ações do corpo, viverão.</w:t>
       </w:r>
     </w:p>
     <w:p>
@@ -4526,7 +4526,7 @@
         <w:rPr>
           <w:lang w:val="pt_PT" w:bidi="pt_PT"/>
         </w:rPr>
-        <w:t xml:space="preserve"> Porque vocês não receberam o espírito de escravidão, para estarem novamente com temor, mas o Espírito de adoção de filhos, pelo qual clamamos: "Aba, Pai".</w:t>
+        <w:t xml:space="preserve"> Pois vocês não receberam um espírito de escravidão para viverem com medo novamente, mas receberam o Espírito que os adota como filhos, pelo qual chamamos: "Aba, Pai".</w:t>
       </w:r>
     </w:p>
     <w:p>
@@ -4589,7 +4589,7 @@
         <w:rPr>
           <w:lang w:val="pt_PT" w:bidi="pt_PT"/>
         </w:rPr>
-        <w:t xml:space="preserve"> Porque considero que os sofrimentos do tempo presente não são comparáveis com a glória futura que será revelada em nós.</w:t>
+        <w:t xml:space="preserve"> Porque considero que os sofrimentos de agora não são comparáveis com a glória futura que será revelada em nós.</w:t>
       </w:r>
     </w:p>
     <w:p>
@@ -4631,7 +4631,7 @@
         <w:rPr>
           <w:lang w:val="pt_PT" w:bidi="pt_PT"/>
         </w:rPr>
-        <w:t xml:space="preserve"> Pois ela foi submetida à vaidade, não por sua vontade, mas por causa daquele que a submeteu, na esperança</w:t>
+        <w:t xml:space="preserve"> Pois a criação foi submetida à fragilidade, não por vontade própria, mas por aquele que a submeteu, na esperança</w:t>
       </w:r>
     </w:p>
     <w:p>
@@ -4652,7 +4652,7 @@
         <w:rPr>
           <w:lang w:val="pt_PT" w:bidi="pt_PT"/>
         </w:rPr>
-        <w:t xml:space="preserve"> de que também a própria criação será libertada da escravidão da corrupção para a gloriosa liberdade dos filhos de Deus.</w:t>
+        <w:t xml:space="preserve"> de que a própria criação também será libertada da escravidão da corrupção para a liberdade gloriosa dos filhos de Deus.</w:t>
       </w:r>
     </w:p>
     <w:p>
@@ -4694,7 +4694,7 @@
         <w:rPr>
           <w:lang w:val="pt_PT" w:bidi="pt_PT"/>
         </w:rPr>
-        <w:t xml:space="preserve"> e não só ela, mas também nós, que temos as primícias do Espírito, gememos em nosso íntimo, esperando a adoção como filhos, isto é, a redenção de nosso corpo.</w:t>
+        <w:t xml:space="preserve"> e não apenas ela, mas também nós, que já temos as primeiras dádivas do Espírito, gememos por dentro, esperando a adoção completa como filhos, isto é, a libertação do nosso corpo.</w:t>
       </w:r>
     </w:p>
     <w:p>
@@ -4715,7 +4715,7 @@
         <w:rPr>
           <w:lang w:val="pt_PT" w:bidi="pt_PT"/>
         </w:rPr>
-        <w:t xml:space="preserve"> Pois nessa esperança fomos salvos. Ora, a esperança que se vê não é esperança; quem espera pelo que está vendo?</w:t>
+        <w:t xml:space="preserve"> Pois nessa esperança fomos salvos. Ora, a esperança que se vê não é esperança. Quem espera pelo que está vendo?</w:t>
       </w:r>
     </w:p>
     <w:p>
@@ -4757,7 +4757,7 @@
         <w:rPr>
           <w:lang w:val="pt_PT" w:bidi="pt_PT"/>
         </w:rPr>
-        <w:t xml:space="preserve"> Da mesma forma, o Espírito também nos ajuda em nossa fraqueza, pois não sabemos pedir como convém, mas ele intercede por nós com gemidos inexprimíveis;</w:t>
+        <w:t xml:space="preserve"> Da mesma forma, o Espírito também nos ajuda quando somos fracos, pois não sabemos como orar corretamente, mas o próprio Espírito intercede por nós com gemidos que não podem ser expressos em palavras;</w:t>
       </w:r>
     </w:p>
     <w:p>
@@ -4799,7 +4799,7 @@
         <w:rPr>
           <w:lang w:val="pt_PT" w:bidi="pt_PT"/>
         </w:rPr>
-        <w:t xml:space="preserve"> Sabemos que todas as coisas cooperam para o bem dos que amam a Deus, a saber, dos que são chamados de acordo com seu propósito.</w:t>
+        <w:t xml:space="preserve"> Sabemos que Deus faz todas as coisas cooperarem para o bem daqueles que o amam, daqueles que foram chamados segundo o seu propósito.</w:t>
       </w:r>
     </w:p>
     <w:p>
@@ -4820,7 +4820,7 @@
         <w:rPr>
           <w:lang w:val="pt_PT" w:bidi="pt_PT"/>
         </w:rPr>
-        <w:t xml:space="preserve"> Porque os que Deus conheceu de antemão, também predestinou a serem conformes à imagem de seu Filho, para que ele fosse o primogênito entre muitos irmãos;</w:t>
+        <w:t xml:space="preserve"> Pois aqueles que Deus conheceu de antemão, também predestinou para serem semelhantes à imagem de seu Filho, para que ele seja o primeiro entre muitos irmãos;</w:t>
       </w:r>
     </w:p>
     <w:p>
@@ -4841,7 +4841,7 @@
         <w:rPr>
           <w:lang w:val="pt_PT" w:bidi="pt_PT"/>
         </w:rPr>
-        <w:t xml:space="preserve"> e aos que predestinou, também chamou; e aos que chamou, também justificou; e aos que justificou, também glorificou.</w:t>
+        <w:t xml:space="preserve"> e aqueles que predestinou, também chamou; os que chamou, também declarou justos; e os que declarou justos, também levou à glória.</w:t>
       </w:r>
     </w:p>
     <w:p>
@@ -4862,7 +4862,7 @@
         <w:rPr>
           <w:lang w:val="pt_PT" w:bidi="pt_PT"/>
         </w:rPr>
-        <w:t xml:space="preserve"> Que diremos, então, diante de todas essas coisas? Se Deus é por nós, quem será contra nós?</w:t>
+        <w:t xml:space="preserve"> Diante disso, o que diremos? Se Deus está a nosso favor, quem poderá ser contra nós?</w:t>
       </w:r>
     </w:p>
     <w:p>
@@ -4988,7 +4988,7 @@
         <w:rPr>
           <w:lang w:val="pt_PT" w:bidi="pt_PT"/>
         </w:rPr>
-        <w:t xml:space="preserve"> Em todas essas coisas, porém, somos mais que vencedores por aquele que nos amou.</w:t>
+        <w:t xml:space="preserve"> Em todas essas coisas, somos plenamente vitoriosos por meio daquele que nos amou.</w:t>
       </w:r>
     </w:p>
     <w:p>
@@ -5009,7 +5009,7 @@
         <w:rPr>
           <w:lang w:val="pt_PT" w:bidi="pt_PT"/>
         </w:rPr>
-        <w:t xml:space="preserve"> Porque tenho certeza de que nem a morte, nem a vida, nem os anjos, nem os principados, nem as coisas presentes, nem as futuras, nem as potestades,</w:t>
+        <w:t xml:space="preserve"> Pois estou convencido de que nem a morte, nem a vida, nem os anjos, nem os principados, nem as potestades, nem o presente, nem o que ainda virá,</w:t>
       </w:r>
     </w:p>
     <w:p>
@@ -5030,7 +5030,7 @@
         <w:rPr>
           <w:lang w:val="pt_PT" w:bidi="pt_PT"/>
         </w:rPr>
-        <w:t xml:space="preserve"> nem a altura, nem a profundidade, nem qualquer outra criatura será capaz de nos separar do amor de Deus, que está em Cristo Jesus, nosso Senhor.</w:t>
+        <w:t xml:space="preserve"> nem a altura, nem a profundidade, nem qualquer outra coisa criada poderá nos separar do amor de Deus que está em Cristo Jesus, nosso Senhor.</w:t>
       </w:r>
     </w:p>
     <w:p>
@@ -5067,7 +5067,7 @@
         <w:rPr>
           <w:lang w:val="pt_PT" w:bidi="pt_PT"/>
         </w:rPr>
-        <w:t xml:space="preserve"> Em Cristo, digo a verdade; não minto, pois minha consciência, guiada pelo Espírito Santo, me dá testemunho disto:</w:t>
+        <w:t xml:space="preserve"> Em Cristo digo a verdade, não minto; minha consciência, controlada pelo Espírito Santo, dá testemunho disso:</w:t>
       </w:r>
     </w:p>
     <w:p>
@@ -5109,7 +5109,7 @@
         <w:rPr>
           <w:lang w:val="pt_PT" w:bidi="pt_PT"/>
         </w:rPr>
-        <w:t xml:space="preserve"> Porque eu mesmo poderia desejar ser anátema, excluído de Cristo, por amor de meus irmãos, que são meus parentes segundo a carne,</w:t>
+        <w:t xml:space="preserve"> Pois eu até desejaria ser separado de Cristo, se isso ajudasse meus irmãos, meus parentes segundo a carne,</w:t>
       </w:r>
     </w:p>
     <w:p>
@@ -5130,7 +5130,7 @@
         <w:rPr>
           <w:lang w:val="pt_PT" w:bidi="pt_PT"/>
         </w:rPr>
-        <w:t xml:space="preserve"> o povo de Israel, dos quais é a adoção como filhos e também a glória, as alianças, a concessão da lei, o culto e as promessas;</w:t>
+        <w:t xml:space="preserve"> o povo de Israel. Deles é a adoção como filhos e também a glória, as alianças, a concessão da lei, o culto e as promessas.</w:t>
       </w:r>
     </w:p>
     <w:p>
@@ -5151,7 +5151,7 @@
         <w:rPr>
           <w:lang w:val="pt_PT" w:bidi="pt_PT"/>
         </w:rPr>
-        <w:t xml:space="preserve"> dos quais são os patriarcas, e dos quais descende a linhagem humana de Cristo, que é sobre todos, Deus bendito para sempre. Amém.</w:t>
+        <w:t xml:space="preserve"> Deles vêm os patriarcas, e deles também procede a linhagem humana de Cristo, que é Deus acima de tudo. Ele é bendito para sempre. Amém.</w:t>
       </w:r>
     </w:p>
     <w:p>
@@ -5172,7 +5172,7 @@
         <w:rPr>
           <w:lang w:val="pt_PT" w:bidi="pt_PT"/>
         </w:rPr>
-        <w:t xml:space="preserve"> Não que a palavra de Deus tenha falhado, pois nem todos os que são de Israel são Israel;</w:t>
+        <w:t xml:space="preserve"> Não é que a palavra de Deus tenha falhado. Nem todos os que pertencem a Israel são, de fato, Israel;</w:t>
       </w:r>
     </w:p>
     <w:p>
@@ -5214,7 +5214,7 @@
         <w:rPr>
           <w:lang w:val="pt_PT" w:bidi="pt_PT"/>
         </w:rPr>
-        <w:t xml:space="preserve"> Ou seja, os filhos da carne não são filhos de Deus, mas sim os filhos da promessa é que são contados como descendência.</w:t>
+        <w:t xml:space="preserve"> Ou seja, não são os filhos naturais que são considerados filhos de Deus, mas os filhos da promessa é que contam como descendência.</w:t>
       </w:r>
     </w:p>
     <w:p>
@@ -5298,7 +5298,7 @@
         <w:rPr>
           <w:lang w:val="pt_PT" w:bidi="pt_PT"/>
         </w:rPr>
-        <w:t xml:space="preserve"> não por obras, mas por aquele que chama —, foi dito a ela: "O mais velho servirá ao mais novo".</w:t>
+        <w:t xml:space="preserve"> não por ações humanas, mas por aquele que chama — foi dito a ela: "O mais velho servirá ao mais novo".</w:t>
       </w:r>
     </w:p>
     <w:p>
@@ -5319,7 +5319,7 @@
         <w:rPr>
           <w:lang w:val="pt_PT" w:bidi="pt_PT"/>
         </w:rPr>
-        <w:t xml:space="preserve"> Como está escrito: "Eu amei Jacó, mas desprezei Esaú".</w:t>
+        <w:t xml:space="preserve"> Como está escrito: "Eu escolhi Jacó, mas rejeitei Esaú".</w:t>
       </w:r>
     </w:p>
     <w:p>
@@ -5340,7 +5340,7 @@
         <w:rPr>
           <w:lang w:val="pt_PT" w:bidi="pt_PT"/>
         </w:rPr>
-        <w:t xml:space="preserve"> Então, que diremos? Deus é injusto? De maneira alguma!</w:t>
+        <w:t xml:space="preserve"> Então, o que diremos? Deus é injusto? De maneira alguma!</w:t>
       </w:r>
     </w:p>
     <w:p>
@@ -5382,7 +5382,7 @@
         <w:rPr>
           <w:lang w:val="pt_PT" w:bidi="pt_PT"/>
         </w:rPr>
-        <w:t xml:space="preserve"> Portanto, isso não depende do desejo nem do esforço humano, mas de Deus, que tem misericórdia.</w:t>
+        <w:t xml:space="preserve"> Portanto, isso não depende do querer humano nem do esforço, mas de Deus, que age com misericórdia.</w:t>
       </w:r>
     </w:p>
     <w:p>
@@ -5424,7 +5424,7 @@
         <w:rPr>
           <w:lang w:val="pt_PT" w:bidi="pt_PT"/>
         </w:rPr>
-        <w:t xml:space="preserve"> Portanto, Deus tem misericórdia de quem ele quer, e endurece a quem ele quer.</w:t>
+        <w:t xml:space="preserve"> Assim, Deus demonstra misericórdia a quem quer e endurece a quem quer.</w:t>
       </w:r>
     </w:p>
     <w:p>
@@ -5445,7 +5445,7 @@
         <w:rPr>
           <w:lang w:val="pt_PT" w:bidi="pt_PT"/>
         </w:rPr>
-        <w:t xml:space="preserve"> Então, me perguntarão: "Por que ele ainda se queixa? Pois quem pode resistir à sua vontade?".</w:t>
+        <w:t xml:space="preserve"> Então, algum de vocês me perguntará: “Se é assim, como Deus pode encontrar culpa nas pessoas? Quem é capaz de resistir à vontade de Deus?”.</w:t>
       </w:r>
     </w:p>
     <w:p>
@@ -5487,7 +5487,7 @@
         <w:rPr>
           <w:lang w:val="pt_PT" w:bidi="pt_PT"/>
         </w:rPr>
-        <w:t xml:space="preserve"> Será que o oleiro não tem autoridade sobre o barro para fazer da mesma massa um vaso para honra e outro para desonra?</w:t>
+        <w:t xml:space="preserve"> O oleiro não tem autoridade sobre o barro para fazer, da mesma massa, um vaso para uso honroso e outro para uso comum?</w:t>
       </w:r>
     </w:p>
     <w:p>
@@ -5508,7 +5508,7 @@
         <w:rPr>
           <w:lang w:val="pt_PT" w:bidi="pt_PT"/>
         </w:rPr>
-        <w:t xml:space="preserve"> E se Deus, querendo mostrar sua ira e tornar conhecido seu poder, suportou com muita longanimidade vasos de ira já preparados para a destruição,</w:t>
+        <w:t xml:space="preserve"> E se Deus, querendo mostrar sua ira e seu poder, suportou com muita paciência vasos de ira preparados para destruição,</w:t>
       </w:r>
     </w:p>
     <w:p>
@@ -5529,7 +5529,7 @@
         <w:rPr>
           <w:lang w:val="pt_PT" w:bidi="pt_PT"/>
         </w:rPr>
-        <w:t xml:space="preserve"> a fim de que também desse a conhecer as riquezas de sua glória sobre vasos de misericórdia, que preparou de antemão para a glória —</w:t>
+        <w:t xml:space="preserve"> para também tornar conhecidas as riquezas da sua glória sobre vasos de misericórdia que ele preparou de antemão para a glória —</w:t>
       </w:r>
     </w:p>
     <w:p>
@@ -5550,7 +5550,7 @@
         <w:rPr>
           <w:lang w:val="pt_PT" w:bidi="pt_PT"/>
         </w:rPr>
-        <w:t xml:space="preserve"> os quais somos nós, que ele também chamou não apenas dentre os judeus, mas também dentre os gentios?</w:t>
+        <w:t xml:space="preserve"> e esses somos nós, que ele chamou não só entre os judeus, mas também entre os gentios?</w:t>
       </w:r>
     </w:p>
     <w:p>
@@ -5613,7 +5613,7 @@
         <w:rPr>
           <w:lang w:val="pt_PT" w:bidi="pt_PT"/>
         </w:rPr>
-        <w:t xml:space="preserve"> A respeito de Israel, Isaías clama: "Ainda que o número dos filhos de Israel seja como a areia do mar, o remanescente será salvo.</w:t>
+        <w:t xml:space="preserve"> A respeito de Israel, Isaías declara: "Ainda que o número dos filhos de Israel seja como a areia do mar, apenas um restante será salvo.</w:t>
       </w:r>
     </w:p>
     <w:p>
@@ -5634,7 +5634,7 @@
         <w:rPr>
           <w:lang w:val="pt_PT" w:bidi="pt_PT"/>
         </w:rPr>
-        <w:t xml:space="preserve"> Pois o Senhor cumprirá plenamente e abreviará sua palavra sobre a terra.</w:t>
+        <w:t xml:space="preserve"> Pois o Senhor cumprirá sua palavra de forma completa e rápida sobre a terra.</w:t>
       </w:r>
     </w:p>
     <w:p>
@@ -5655,7 +5655,7 @@
         <w:rPr>
           <w:lang w:val="pt_PT" w:bidi="pt_PT"/>
         </w:rPr>
-        <w:t xml:space="preserve"> E como prenunciou Isaías: "Se o Senhor dos Exércitos não nos tivesse deixado descendência, nós nos teríamos tornado como Sodoma e semelhantes a Gomorra".</w:t>
+        <w:t xml:space="preserve"> E como Isaías já havia anunciado: "Se o Senhor dos Exércitos não nos tivesse deixado descendência, teríamos nos tornado como Sodoma e semelhantes a Gomorra".</w:t>
       </w:r>
     </w:p>
     <w:p>
@@ -5676,7 +5676,7 @@
         <w:rPr>
           <w:lang w:val="pt_PT" w:bidi="pt_PT"/>
         </w:rPr>
-        <w:t xml:space="preserve"> Então, que diremos? Os gentios, que não buscavam justiça, alcançaram-na, a saber, a justiça que vem da fé;</w:t>
+        <w:t xml:space="preserve"> Então, o que diremos? Que os gentios, que não buscavam justiça, alcançaram justiça, isto é, a justiça que vem da fé;</w:t>
       </w:r>
     </w:p>
     <w:p>
@@ -5697,7 +5697,7 @@
         <w:rPr>
           <w:lang w:val="pt_PT" w:bidi="pt_PT"/>
         </w:rPr>
-        <w:t xml:space="preserve"> e Israel, buscando a lei da justiça, não alcançou essa lei.</w:t>
+        <w:t xml:space="preserve"> mas Israel, buscando uma lei de justiça, não conseguiu alcançá-la.</w:t>
       </w:r>
     </w:p>
     <w:p>
@@ -5718,7 +5718,7 @@
         <w:rPr>
           <w:lang w:val="pt_PT" w:bidi="pt_PT"/>
         </w:rPr>
-        <w:t xml:space="preserve"> Por quê? Porque não a buscava pela fé, mas como se fosse por obras; tropeçou na pedra de tropeço,</w:t>
+        <w:t xml:space="preserve"> Por quê? Porque não a buscavam pela fé, mas como se fosse por obras; tropeçaram na pedra de tropeço,</w:t>
       </w:r>
     </w:p>
     <w:p>
@@ -5739,7 +5739,7 @@
         <w:rPr>
           <w:lang w:val="pt_PT" w:bidi="pt_PT"/>
         </w:rPr>
-        <w:t xml:space="preserve"> como está escrito: "Eis que ponho em Sião uma pedra de tropeço e uma rocha de escândalo; e quem crer nela não será confundido".</w:t>
+        <w:t xml:space="preserve"> como está escrito: "Eis que coloco em Sião uma pedra que faz cair e uma rocha que causa escândalo; e quem crer nela não será envergonhado".</w:t>
       </w:r>
     </w:p>
     <w:p>
@@ -5818,7 +5818,7 @@
         <w:rPr>
           <w:lang w:val="pt_PT" w:bidi="pt_PT"/>
         </w:rPr>
-        <w:t xml:space="preserve"> porque, não conhecendo a justiça que vem de Deus e buscando estabelecer sua própria justiça, não se sujeitaram à justiça de Deus.</w:t>
+        <w:t xml:space="preserve"> porque, não conhecendo a justiça que vem de Deus e tentando estabelecer a própria, não se submeteram à justiça de Deus.</w:t>
       </w:r>
     </w:p>
     <w:p>
@@ -5839,7 +5839,7 @@
         <w:rPr>
           <w:lang w:val="pt_PT" w:bidi="pt_PT"/>
         </w:rPr>
-        <w:t xml:space="preserve"> Pois Cristo é o fim da lei, para justiça de todo o que crê.</w:t>
+        <w:t xml:space="preserve"> Pois, com Cristo, a lei chegou ao seu fim, para que haja justiça para todo aquele que crê.</w:t>
       </w:r>
     </w:p>
     <w:p>
@@ -5860,7 +5860,7 @@
         <w:rPr>
           <w:lang w:val="pt_PT" w:bidi="pt_PT"/>
         </w:rPr>
-        <w:t xml:space="preserve"> Ora, Moisés escreve a respeito da justiça que vem da lei: "O homem que pratica essa justiça viverá por ela".</w:t>
+        <w:t xml:space="preserve"> Moisés escreve sobre a justiça que vem da lei: "Quem cumprir essas coisas viverá por elas".</w:t>
       </w:r>
     </w:p>
     <w:p>
@@ -5881,7 +5881,7 @@
         <w:rPr>
           <w:lang w:val="pt_PT" w:bidi="pt_PT"/>
         </w:rPr>
-        <w:t xml:space="preserve"> Mas a justiça que vem da fé diz o seguinte: "Não pergunte em seu coração: 'Quem subirá ao céu?' (isto é, para trazer Cristo lá do alto)</w:t>
+        <w:t xml:space="preserve"> Mas a justiça que vem da fé diz: "Não diga no coração: 'Quem subirá ao céu?' (isto é, para trazer Cristo de lá)</w:t>
       </w:r>
     </w:p>
     <w:p>
@@ -5902,7 +5902,7 @@
         <w:rPr>
           <w:lang w:val="pt_PT" w:bidi="pt_PT"/>
         </w:rPr>
-        <w:t xml:space="preserve"> ou 'Quem descerá ao abismo?' (isto é, para levantar Cristo dos mortos)".</w:t>
+        <w:t xml:space="preserve"> ou: 'Quem descerá ao abismo?' (isto é, para trazer Cristo de volta dentre os mortos)".</w:t>
       </w:r>
     </w:p>
     <w:p>
@@ -5923,7 +5923,7 @@
         <w:rPr>
           <w:lang w:val="pt_PT" w:bidi="pt_PT"/>
         </w:rPr>
-        <w:t xml:space="preserve"> Mas o que ela diz? "A palavra está perto de você, em sua boca e em seu coração"; isto é, a palavra da fé que proclamamos.</w:t>
+        <w:t xml:space="preserve"> Mas o que ela diz é isto: "A mensagem está próxima de você, na sua boca e no seu coração"; isto é, a mensagem da fé que anunciamos.</w:t>
       </w:r>
     </w:p>
     <w:p>
@@ -5944,7 +5944,7 @@
         <w:rPr>
           <w:lang w:val="pt_PT" w:bidi="pt_PT"/>
         </w:rPr>
-        <w:t xml:space="preserve"> Se confessar com sua boca que Jesus é Senhor e crer em seu coração que Deus o ressuscitou dentre os mortos, você será salvo;</w:t>
+        <w:t xml:space="preserve"> Se você declarar com a boca que Jesus é Senhor e crer no coração que Deus o ressuscitou dentre os mortos, será salvo;</w:t>
       </w:r>
     </w:p>
     <w:p>
@@ -5965,7 +5965,7 @@
         <w:rPr>
           <w:lang w:val="pt_PT" w:bidi="pt_PT"/>
         </w:rPr>
-        <w:t xml:space="preserve"> visto que com o coração se crê para a justiça e com a boca se confessa para a salvação.</w:t>
+        <w:t xml:space="preserve"> pois é com o coração que se crê para ser considerado justo, e com a boca que se declara para a salvação.</w:t>
       </w:r>
     </w:p>
     <w:p>
@@ -5986,7 +5986,7 @@
         <w:rPr>
           <w:lang w:val="pt_PT" w:bidi="pt_PT"/>
         </w:rPr>
-        <w:t xml:space="preserve"> Porque a Escritura diz: "Todo o que crê nele não será confundido".</w:t>
+        <w:t xml:space="preserve"> A Escritura diz: "Todo aquele que crer nele não será envergonhado".</w:t>
       </w:r>
     </w:p>
     <w:p>
@@ -6070,7 +6070,7 @@
         <w:rPr>
           <w:lang w:val="pt_PT" w:bidi="pt_PT"/>
         </w:rPr>
-        <w:t xml:space="preserve"> E como pregarão, se não forem enviados? Como está escrito: "Como são belos os pés daqueles que anunciam a paz; daqueles que trazem boas-novas!".</w:t>
+        <w:t xml:space="preserve"> E como pregarão se não forem enviados? Como está escrito: "Como são bem-vindos os passos daqueles que anunciam boas notícias de paz!".</w:t>
       </w:r>
     </w:p>
     <w:p>
@@ -6112,7 +6112,7 @@
         <w:rPr>
           <w:lang w:val="pt_PT" w:bidi="pt_PT"/>
         </w:rPr>
-        <w:t xml:space="preserve"> Assim, a fé vem pelo ouvir, e o ouvir, pela palavra de Cristo.</w:t>
+        <w:t xml:space="preserve"> Assim, a fé nasce do ouvir, e o ouvir vem da mensagem sobre Cristo.</w:t>
       </w:r>
     </w:p>
     <w:p>
@@ -6133,7 +6133,7 @@
         <w:rPr>
           <w:lang w:val="pt_PT" w:bidi="pt_PT"/>
         </w:rPr>
-        <w:t xml:space="preserve"> Mas eu pergunto: Eles não ouviram? É claro que ouviram! "A voz deles saiu por toda a terra, e suas palavras, até os confins do mundo."</w:t>
+        <w:t xml:space="preserve"> Mas pergunto: eles não ouviram? Claro que ouviram! "Sua voz se espalhou por toda a terra, e suas palavras chegaram até os confins do mundo".</w:t>
       </w:r>
     </w:p>
     <w:p>
@@ -6154,7 +6154,7 @@
         <w:rPr>
           <w:lang w:val="pt_PT" w:bidi="pt_PT"/>
         </w:rPr>
-        <w:t xml:space="preserve"> Pergunto mais uma vez: Será que o povo de Israel não entendeu? Primeiro, Moisés disse: "Farei com que tenham ciúmes de um povo que não é povo; eu os provocarei à ira por meio de um povo insensato".</w:t>
+        <w:t xml:space="preserve"> Pergunto mais uma vez: será que o povo de Israel não entendeu? Primeiro, Moisés disse: "Farei com que tenham ciúmes de um povo que não é povo. Eu os provocarei à ira por meio de um povo insensato".</w:t>
       </w:r>
     </w:p>
     <w:p>
@@ -6175,7 +6175,7 @@
         <w:rPr>
           <w:lang w:val="pt_PT" w:bidi="pt_PT"/>
         </w:rPr>
-        <w:t xml:space="preserve"> Isaías diz com ousadia: "Fui achado por quem não me buscava; manifestei-me a quem não perguntava por mim".</w:t>
+        <w:t xml:space="preserve"> E Isaías afirma com coragem: "Fui encontrado por quem não me procurava; manifestei-me a quem não perguntava por mim".</w:t>
       </w:r>
     </w:p>
     <w:p>
@@ -6196,7 +6196,7 @@
         <w:rPr>
           <w:lang w:val="pt_PT" w:bidi="pt_PT"/>
         </w:rPr>
-        <w:t xml:space="preserve"> Mas, em relação a Israel, ele diz: "O tempo todo estendi as mãos a um povo desobediente e rebelde".</w:t>
+        <w:t xml:space="preserve"> Mas, sobre Israel, ele diz: "O tempo todo estendi minhas mãos a um povo que desobedece e se opõe".</w:t>
       </w:r>
     </w:p>
     <w:p>
@@ -6254,7 +6254,7 @@
         <w:rPr>
           <w:lang w:val="pt_PT" w:bidi="pt_PT"/>
         </w:rPr>
-        <w:t xml:space="preserve"> Deus não rejeitou seu povo, a quem conheceu de antemão. Ou vocês não sabem como Elias insistiu a Deus contra Israel, como diz a Escritura?:</w:t>
+        <w:t xml:space="preserve"> Deus não rejeitou o seu povo, aquele que ele conheceu antes. Ou vocês não sabem o que a Escritura diz sobre Elias, quando ele fala contra Israel?</w:t>
       </w:r>
     </w:p>
     <w:p>
@@ -6317,7 +6317,7 @@
         <w:rPr>
           <w:lang w:val="pt_PT" w:bidi="pt_PT"/>
         </w:rPr>
-        <w:t xml:space="preserve"> Assim, pois, também há nos dias de hoje um remanescente, escolhido segundo a graça.</w:t>
+        <w:t xml:space="preserve"> Assim também, no presente tempo, existe um restante escolhido pela graça.</w:t>
       </w:r>
     </w:p>
     <w:p>
@@ -6338,7 +6338,7 @@
         <w:rPr>
           <w:lang w:val="pt_PT" w:bidi="pt_PT"/>
         </w:rPr>
-        <w:t xml:space="preserve"> Pois, se é pela graça, não é mais por obras; caso contrário, a graça deixaria de ser graça.</w:t>
+        <w:t xml:space="preserve"> Se é pela graça, então não é por obras. Caso contrário, a graça deixaria de ser graça.</w:t>
       </w:r>
     </w:p>
     <w:p>
@@ -6359,7 +6359,7 @@
         <w:rPr>
           <w:lang w:val="pt_PT" w:bidi="pt_PT"/>
         </w:rPr>
-        <w:t xml:space="preserve"> Que diremos, então? Israel não alcançou o que buscava, mas a eleição o alcançou. Os demais foram endurecidos,</w:t>
+        <w:t xml:space="preserve"> Então, o que dizer? Israel não alcançou o que buscava, mas os escolhidos alcançaram; os demais foram endurecidos.</w:t>
       </w:r>
     </w:p>
     <w:p>
@@ -6380,7 +6380,7 @@
         <w:rPr>
           <w:lang w:val="pt_PT" w:bidi="pt_PT"/>
         </w:rPr>
-        <w:t xml:space="preserve"> como está escrito: "Deus lhes deu um espírito de sono profundo, olhos para não ver e ouvidos para não ouvir, até os dias de hoje".</w:t>
+        <w:t xml:space="preserve"> Como está escrito: "Deus lhes deu um espírito de insensibilidade, olhos que não veem e ouvidos que não ouvem, até hoje".</w:t>
       </w:r>
     </w:p>
     <w:p>
@@ -6443,7 +6443,7 @@
         <w:rPr>
           <w:lang w:val="pt_PT" w:bidi="pt_PT"/>
         </w:rPr>
-        <w:t xml:space="preserve"> Pergunto, então: Tropeçaram para que caíssem? De maneira alguma! Pelo contrário, porque eles pecaram, a salvação chegou aos gentios para fazer com que os judeus ficassem com ciúmes.</w:t>
+        <w:t xml:space="preserve"> Pergunto então: eles tropeçaram para cair definitivamente? De forma alguma! Pelo contrário, por causa da sua queda, a salvação chegou aos gentios, para provocar ciúmes em Israel.</w:t>
       </w:r>
     </w:p>
     <w:p>
@@ -6464,7 +6464,7 @@
         <w:rPr>
           <w:lang w:val="pt_PT" w:bidi="pt_PT"/>
         </w:rPr>
-        <w:t xml:space="preserve"> Se, portanto, a queda deles significou riqueza para o mundo, e seu abatimento significou riqueza para os gentios, quanto mais sua plenitude!</w:t>
+        <w:t xml:space="preserve"> Se a queda deles trouxe riqueza ao mundo, e sua diminuição trouxe riqueza aos gentios, quanto mais será a plenitude deles!</w:t>
       </w:r>
     </w:p>
     <w:p>
@@ -6548,7 +6548,7 @@
         <w:rPr>
           <w:lang w:val="pt_PT" w:bidi="pt_PT"/>
         </w:rPr>
-        <w:t xml:space="preserve"> Se as primícias são santas, a massa também é santa; e, se a raiz é santa, os ramos também são santos.</w:t>
+        <w:t xml:space="preserve"> Se as primeiras porções são santas, toda a massa também é santa; e, se a raiz é santa, os ramos também o são.</w:t>
       </w:r>
     </w:p>
     <w:p>
@@ -6590,7 +6590,7 @@
         <w:rPr>
           <w:lang w:val="pt_PT" w:bidi="pt_PT"/>
         </w:rPr>
-        <w:t xml:space="preserve"> não se glorie contra os ramos; e, se fizer isso, saiba que não é você que sustenta a raiz, mas a raiz que o sustenta.</w:t>
+        <w:t xml:space="preserve"> não se glorie contra os ramos. Se fizer isso, saiba que não é você que sustenta a raiz, mas a raiz que o sustenta.</w:t>
       </w:r>
     </w:p>
     <w:p>
@@ -6674,7 +6674,7 @@
         <w:rPr>
           <w:lang w:val="pt_PT" w:bidi="pt_PT"/>
         </w:rPr>
-        <w:t xml:space="preserve"> Considere, pois, a bondade e a severidade de Deus: severidade para os que caíram; mas bondade para você, se permanecer na bondade. Caso contrário, você também será cortado.</w:t>
+        <w:t xml:space="preserve"> Observe, então, a bondade e a firmeza de Deus: firmeza para os que caíram, mas bondade para você, desde que permaneça nela. Caso contrário, você também será cortado.</w:t>
       </w:r>
     </w:p>
     <w:p>
@@ -6737,7 +6737,7 @@
         <w:rPr>
           <w:lang w:val="pt_PT" w:bidi="pt_PT"/>
         </w:rPr>
-        <w:t xml:space="preserve"> Irmãos, não quero que ignorem este mistério (para que não se considerem sábios em si mesmos): o endurecimento veio em parte a Israel, até que a plenitude dos gentios seja alcançada.</w:t>
+        <w:t xml:space="preserve"> Irmãos, não quero que ignorem este mistério (para que não se tornem autossuficientes): parte de Israel ficou endurecida até que a totalidade dos gentios seja alcançada.</w:t>
       </w:r>
     </w:p>
     <w:p>
@@ -6758,7 +6758,7 @@
         <w:rPr>
           <w:lang w:val="pt_PT" w:bidi="pt_PT"/>
         </w:rPr>
-        <w:t xml:space="preserve"> E assim todo o Israel será salvo, como está escrito: "Virá de Sião o Libertador que desviará de Jacó as impiedades.</w:t>
+        <w:t xml:space="preserve"> E assim todo o Israel será salvo, como está escrito: "Virá de Sião o Libertador, que afastará de Jacó toda impiedade.</w:t>
       </w:r>
     </w:p>
     <w:p>
@@ -6800,7 +6800,7 @@
         <w:rPr>
           <w:lang w:val="pt_PT" w:bidi="pt_PT"/>
         </w:rPr>
-        <w:t xml:space="preserve"> Quanto ao evangelho, eles são inimigos por causa de vocês; mas, quanto à eleição, porém, são amados por causa dos patriarcas;</w:t>
+        <w:t xml:space="preserve"> Quanto ao evangelho, eles são inimigos por causa de vocês. Quanto à eleição, porém, são amados por causa dos patriarcas,</w:t>
       </w:r>
     </w:p>
     <w:p>
@@ -6842,7 +6842,7 @@
         <w:rPr>
           <w:lang w:val="pt_PT" w:bidi="pt_PT"/>
         </w:rPr>
-        <w:t xml:space="preserve"> Assim como vocês, no passado, não foram obedientes a Deus, mas agora receberam misericórdia por causa da desobediência deles,</w:t>
+        <w:t xml:space="preserve"> No passado, vocês não foram obedientes a Deus, mas agora receberam misericórdia por causa da desobediência deles.</w:t>
       </w:r>
     </w:p>
     <w:p>
@@ -6863,7 +6863,7 @@
         <w:rPr>
           <w:lang w:val="pt_PT" w:bidi="pt_PT"/>
         </w:rPr>
-        <w:t xml:space="preserve"> assim também eles, agora, foram desobedientes para também receberem misericórdia, graças à que foi demonstrada a vocês.</w:t>
+        <w:t xml:space="preserve"> Agora eles estão em rebeldia. E Deus mostrou misericórdia a vocês, para que eles também recebam essa mesma misericórdia.</w:t>
       </w:r>
     </w:p>
     <w:p>
@@ -6884,7 +6884,7 @@
         <w:rPr>
           <w:lang w:val="pt_PT" w:bidi="pt_PT"/>
         </w:rPr>
-        <w:t xml:space="preserve"> Porque Deus encerrou a todos na desobediência, para mostrar misericórdia a todos.</w:t>
+        <w:t xml:space="preserve"> Pois Deus colocou todos sob desobediência, para depois mostrar misericórdia a todos.</w:t>
       </w:r>
     </w:p>
     <w:p>
@@ -6905,7 +6905,7 @@
         <w:rPr>
           <w:lang w:val="pt_PT" w:bidi="pt_PT"/>
         </w:rPr>
-        <w:t xml:space="preserve"> Ó profundidade das riquezas, tanto da sabedoria como do conhecimento de Deus! Como são insondáveis seus juízos, e inescrutáveis, seus caminhos!</w:t>
+        <w:t xml:space="preserve"> Ó profundidade da riqueza, da sabedoria e do conhecimento de Deus! Como é difícil compreendermos suas decisões e seus caminhos!</w:t>
       </w:r>
     </w:p>
     <w:p>
@@ -7005,7 +7005,7 @@
         <w:rPr>
           <w:lang w:val="pt_PT" w:bidi="pt_PT"/>
         </w:rPr>
-        <w:t xml:space="preserve"> Portanto, irmãos, pelas misericórdias de Deus, rogo que apresentem seu corpo a Deus como sacrifício vivo, santo e agradável, que é o culto racional de vocês.</w:t>
+        <w:t xml:space="preserve"> Portanto, irmãos, por causa das misericórdias de Deus, peço que entreguem o corpo de vocês a Deus como oferta viva, santa e agradável. Esse é o culto consciente de vocês.</w:t>
       </w:r>
     </w:p>
     <w:p>
@@ -7026,7 +7026,7 @@
         <w:rPr>
           <w:lang w:val="pt_PT" w:bidi="pt_PT"/>
         </w:rPr>
-        <w:t xml:space="preserve"> E não se conformem com este mundo, mas sejam transformados pela renovação de sua mente, para que possam provar qual é a boa, agradável e perfeita vontade de Deus.</w:t>
+        <w:t xml:space="preserve"> Não adotem o modo de viver desta época, mas deixem que Deus transforme vocês pela renovação da mente, para que entendam qual é a vontade de Deus: boa, agradável e perfeita.</w:t>
       </w:r>
     </w:p>
     <w:p>
@@ -7047,7 +7047,7 @@
         <w:rPr>
           <w:lang w:val="pt_PT" w:bidi="pt_PT"/>
         </w:rPr>
-        <w:t xml:space="preserve"> Pois, pela graça que me foi dada, digo a cada um de vocês: não pense de si mesmo além do que convém; mas pense com equilíbrio, segundo a medida da fé que Deus concedeu a cada um.</w:t>
+        <w:t xml:space="preserve"> Pela graça que me foi dada, digo a cada um de vocês: ninguém deve pensar sobre si mesmo mais do que é correto. Pelo contrário, pensem com humildade e equilíbrio, conforme a medida de fé que Deus deu a cada um.</w:t>
       </w:r>
     </w:p>
     <w:p>
@@ -7068,7 +7068,7 @@
         <w:rPr>
           <w:lang w:val="pt_PT" w:bidi="pt_PT"/>
         </w:rPr>
-        <w:t xml:space="preserve"> Porque, assim como temos muitos membros em um corpo, e nem todos os membros exercem a mesma função,</w:t>
+        <w:t xml:space="preserve"> Porque, assim como temos muitos membros num corpo, e nem todos os membros exercem a mesma função,</w:t>
       </w:r>
     </w:p>
     <w:p>
@@ -7110,7 +7110,7 @@
         <w:rPr>
           <w:lang w:val="pt_PT" w:bidi="pt_PT"/>
         </w:rPr>
-        <w:t xml:space="preserve"> Temos diferentes dons, segundo a graça que nos é dada: se é profetizar, seja conforme a proporção da fé;</w:t>
+        <w:t xml:space="preserve"> Temos dons diferentes, conforme a graça que recebemos. Se alguém recebeu o dom de profetizar, use-o de acordo com a fé que possui;</w:t>
       </w:r>
     </w:p>
     <w:p>
@@ -7152,7 +7152,7 @@
         <w:rPr>
           <w:lang w:val="pt_PT" w:bidi="pt_PT"/>
         </w:rPr>
-        <w:t xml:space="preserve"> se é exortar, exorte; se é repartir, faça-o com generosidade; se é exercer liderança, exerça-a com zelo; se é mostrar misericórdia, faça-o com alegria.</w:t>
+        <w:t xml:space="preserve"> se é encorajar, encoraje; se é ajudar com seus bens, faça isso com generosidade; se é liderar, faça com dedicação; se é demonstrar misericórdia, faça isso com alegria.</w:t>
       </w:r>
     </w:p>
     <w:p>
@@ -7194,7 +7194,7 @@
         <w:rPr>
           <w:lang w:val="pt_PT" w:bidi="pt_PT"/>
         </w:rPr>
-        <w:t xml:space="preserve"> Amem cordialmente uns aos outros com amor fraternal, dando sempre preferência aos outros.</w:t>
+        <w:t xml:space="preserve"> Amem uns aos outros com carinho fraternal e deem honra aos outros acima de si mesmos.</w:t>
       </w:r>
     </w:p>
     <w:p>
@@ -7215,7 +7215,7 @@
         <w:rPr>
           <w:lang w:val="pt_PT" w:bidi="pt_PT"/>
         </w:rPr>
-        <w:t xml:space="preserve"> Não sejam negligentes no zelo; mantenham o fervor do espírito, servindo ao Senhor.</w:t>
+        <w:t xml:space="preserve"> Não sejam preguiçosos no cuidado da obra de Deus. Mantenham o espírito cheio de fervor e sirvam ao Senhor.</w:t>
       </w:r>
     </w:p>
     <w:p>
@@ -7257,7 +7257,7 @@
         <w:rPr>
           <w:lang w:val="pt_PT" w:bidi="pt_PT"/>
         </w:rPr>
-        <w:t xml:space="preserve"> Ajudem a suprir as necessidades dos santos; exercitem a hospitalidade.</w:t>
+        <w:t xml:space="preserve"> Ajudem os santos em suas necessidades e estejam sempre prontos para receber pessoas em casa.</w:t>
       </w:r>
     </w:p>
     <w:p>
@@ -7320,7 +7320,7 @@
         <w:rPr>
           <w:lang w:val="pt_PT" w:bidi="pt_PT"/>
         </w:rPr>
-        <w:t xml:space="preserve"> Tenham o mesmo sentimento uns para com os outros; não ambicionem coisas altivas, mas se associem com os humildes; não se considerem sábios em si mesmos.</w:t>
+        <w:t xml:space="preserve"> Vivam em harmonia uns com os outros. Não sejam orgulhosos, mas aproximem-se dos humildes. Não pensem que vocês são sábios por conta própria.</w:t>
       </w:r>
     </w:p>
     <w:p>
@@ -7383,7 +7383,7 @@
         <w:rPr>
           <w:lang w:val="pt_PT" w:bidi="pt_PT"/>
         </w:rPr>
-        <w:t xml:space="preserve"> Amados, não se vinguem, mas deixem a ira nas mãos de Deus, pois está escrito: "Minha é a vingança; eu é que retribuirei", diz o Senhor.</w:t>
+        <w:t xml:space="preserve"> Queridos, não procurem vingança por si mesmos, mas deixem espaço para a justiça de Deus, porque está escrito: "A vingança pertence a mim; eu retribuirei", diz o Senhor.</w:t>
       </w:r>
     </w:p>
     <w:p>
@@ -7404,7 +7404,7 @@
         <w:rPr>
           <w:lang w:val="pt_PT" w:bidi="pt_PT"/>
         </w:rPr>
-        <w:t xml:space="preserve"> Ao contrário: "Se seu inimigo estiver com fome, dê-lhe de comer; se ele estiver com sede, dê-lhe de beber, pois, ao fazer isso, você amontoará brasas de fogo sobre a cabeça dele".</w:t>
+        <w:t xml:space="preserve"> Pelo contrário: "Se o seu inimigo estiver com fome, dê comida a ele; se tiver sede, dê água. Agindo assim, você colocará brasas vivas sobre a cabeça dele".</w:t>
       </w:r>
     </w:p>
     <w:p>
@@ -7425,7 +7425,7 @@
         <w:rPr>
           <w:lang w:val="pt_PT" w:bidi="pt_PT"/>
         </w:rPr>
-        <w:t xml:space="preserve"> Não se deixem vencer pelo mal, mas vençam o mal com o bem.</w:t>
+        <w:t xml:space="preserve"> Não deixem que o mal vença vocês. Ao contrário, vençam o mal praticando o bem.</w:t>
       </w:r>
     </w:p>
     <w:p>
@@ -7462,7 +7462,7 @@
         <w:rPr>
           <w:lang w:val="pt_PT" w:bidi="pt_PT"/>
         </w:rPr>
-        <w:t xml:space="preserve"> Todos se submetam às autoridades superiores, pois não há autoridade que não venha de Deus, e as que existem foram estabelecidas por ele.</w:t>
+        <w:t xml:space="preserve"> Todos devem se sujeitar às autoridades constituídas, porque não existe autoridade sem a permissão de Deus, e as que existem foram colocadas por ele.</w:t>
       </w:r>
     </w:p>
     <w:p>
@@ -7483,7 +7483,7 @@
         <w:rPr>
           <w:lang w:val="pt_PT" w:bidi="pt_PT"/>
         </w:rPr>
-        <w:t xml:space="preserve"> Portanto, quem se opõe à autoridade resiste à ordenação de Deus; e os que resistem receberão juízo sobre si mesmos.</w:t>
+        <w:t xml:space="preserve"> Por isso, quem se levanta contra a autoridade resiste àquilo que Deus estabeleceu; e os que agem assim trarão julgamento sobre si mesmos.</w:t>
       </w:r>
     </w:p>
     <w:p>
@@ -7504,7 +7504,7 @@
         <w:rPr>
           <w:lang w:val="pt_PT" w:bidi="pt_PT"/>
         </w:rPr>
-        <w:t xml:space="preserve"> Porque os governantes não são motivo de temor para quem faz o bem, mas para quem faz o mal. Se você não quiser ter medo da autoridade, faça o bem, e dela receberá elogio.</w:t>
+        <w:t xml:space="preserve"> Os governantes não causam medo a quem pratica o bem, mas a quem pratica o mal. Você quer viver sem medo da autoridade? Faça o bem, e ela reconhecerá isso.</w:t>
       </w:r>
     </w:p>
     <w:p>
@@ -7525,7 +7525,7 @@
         <w:rPr>
           <w:lang w:val="pt_PT" w:bidi="pt_PT"/>
         </w:rPr>
-        <w:t xml:space="preserve"> Pois ela é serva de Deus para seu bem. Mas se você fizer o mal, tema, porque não é em vão que ela traz a espada. É serva de Deus, vingadora, para exercer ira em quem faz o mal.</w:t>
+        <w:t xml:space="preserve"> Porque ela é serva de Deus para o seu bem. Mas, se você praticar o mal, tenha medo, pois ela não carrega a espada sem motivo. Ela é serva de Deus para aplicar justiça contra quem pratica o mal.</w:t>
       </w:r>
     </w:p>
     <w:p>
@@ -7546,7 +7546,7 @@
         <w:rPr>
           <w:lang w:val="pt_PT" w:bidi="pt_PT"/>
         </w:rPr>
-        <w:t xml:space="preserve"> Portanto, é necessário que vocês se submetam, não somente por causa da ira, mas também por causa da consciência.</w:t>
+        <w:t xml:space="preserve"> Por isso é necessário obedecer, não apenas por medo da punição, mas também por questão de consciência.</w:t>
       </w:r>
     </w:p>
     <w:p>
@@ -7567,7 +7567,7 @@
         <w:rPr>
           <w:lang w:val="pt_PT" w:bidi="pt_PT"/>
         </w:rPr>
-        <w:t xml:space="preserve"> É por isso também que vocês pagam impostos, pois as autoridades estão a serviço de Deus e se dedicam continuamente a isso.</w:t>
+        <w:t xml:space="preserve"> É também por isso que vocês pagam impostos, porque as autoridades são ministros a serviço de Deus e se dedicam continuamente a essa função.</w:t>
       </w:r>
     </w:p>
     <w:p>
@@ -7588,7 +7588,7 @@
         <w:rPr>
           <w:lang w:val="pt_PT" w:bidi="pt_PT"/>
         </w:rPr>
-        <w:t xml:space="preserve"> Paguem a todos o que vocês devem: a quem imposto, imposto; a quem tributo, tributo; a quem temor, temor; a quem honra, honra.</w:t>
+        <w:t xml:space="preserve"> Deem a cada um aquilo que lhe é devido: imposto a quem se deve imposto, tributo a quem se deve tributo, respeito a quem merece respeito e honra a quem merece honra.</w:t>
       </w:r>
     </w:p>
     <w:p>
@@ -7609,7 +7609,7 @@
         <w:rPr>
           <w:lang w:val="pt_PT" w:bidi="pt_PT"/>
         </w:rPr>
-        <w:t xml:space="preserve"> Não devam nada a ninguém, exceto o amor de uns para com os outros; pois quem ama o outro tem cumprido a lei.</w:t>
+        <w:t xml:space="preserve"> Não fiquem devendo nada a ninguém, a não ser o amor entre vocês, porque quem ama o próximo cumpriu a lei.</w:t>
       </w:r>
     </w:p>
     <w:p>
@@ -7630,7 +7630,7 @@
         <w:rPr>
           <w:lang w:val="pt_PT" w:bidi="pt_PT"/>
         </w:rPr>
-        <w:t xml:space="preserve"> Pois estes mandamentos: "Não adulterarás, não matarás, não furtarás, não cobiçarás", e qualquer outro que houver, se resumem nesta palavra: "Ame o seu próximo como a si mesmo".</w:t>
+        <w:t xml:space="preserve"> Pois os mandamentos: "Não adulterarás, não matarás, não furtarás, não cobiçarás", e qualquer outro mandamento, se resumem nesta frase: "Ame o seu próximo como ama a si mesmo".</w:t>
       </w:r>
     </w:p>
     <w:p>
@@ -7651,7 +7651,7 @@
         <w:rPr>
           <w:lang w:val="pt_PT" w:bidi="pt_PT"/>
         </w:rPr>
-        <w:t xml:space="preserve"> O amor não faz mal ao próximo. Portanto, o amor é o cumprimento da lei.</w:t>
+        <w:t xml:space="preserve"> O amor não pratica o mal contra o próximo. Portanto, amar é viver plenamente a lei.</w:t>
       </w:r>
     </w:p>
     <w:p>
@@ -7672,7 +7672,7 @@
         <w:rPr>
           <w:lang w:val="pt_PT" w:bidi="pt_PT"/>
         </w:rPr>
-        <w:t xml:space="preserve"> E isto digo, conhecendo o tempo, que já é hora de vocês despertarem do sono, pois nossa salvação está agora mais perto de nós do que quando cremos.</w:t>
+        <w:t xml:space="preserve"> Façam isso entendendo o tempo em que vivemos: já chegou a hora de acordarem, porque agora a nossa salvação está mais perto do que quando cremos pela primeira vez.</w:t>
       </w:r>
     </w:p>
     <w:p>
@@ -7693,7 +7693,7 @@
         <w:rPr>
           <w:lang w:val="pt_PT" w:bidi="pt_PT"/>
         </w:rPr>
-        <w:t xml:space="preserve"> A noite está adiantada, e vem chegando o dia. Deixemos, pois, as obras das trevas e vistamos as armas da luz.</w:t>
+        <w:t xml:space="preserve"> A noite já está chegando ao fim, e o dia está se aproximando. Portanto, deixemos as obras das trevas e vistamos aquilo que pertence à luz.</w:t>
       </w:r>
     </w:p>
     <w:p>
@@ -7714,7 +7714,7 @@
         <w:rPr>
           <w:lang w:val="pt_PT" w:bidi="pt_PT"/>
         </w:rPr>
-        <w:t xml:space="preserve"> Andemos decentemente, como quem age à luz do dia, não em orgias e bebedeiras, não em imoralidade sexual e depravação, não em contendas e ciúmes;</w:t>
+        <w:t xml:space="preserve"> Vivamos de maneira correta, como quem anda à luz do dia; não em festas descontroladas e bebedeiras, nem em imoralidade sexual e práticas indecentes, nem em brigas e inveja.</w:t>
       </w:r>
     </w:p>
     <w:p>
@@ -7735,7 +7735,7 @@
         <w:rPr>
           <w:lang w:val="pt_PT" w:bidi="pt_PT"/>
         </w:rPr>
-        <w:t xml:space="preserve"> mas se revistam do Senhor Jesus Cristo e não façam nada para satisfazer os desejos da carne.</w:t>
+        <w:t xml:space="preserve"> Pelo contrário, revistam-se do Senhor Jesus Cristo e não alimentem os desejos da natureza humana.</w:t>
       </w:r>
     </w:p>
     <w:p>
@@ -7772,7 +7772,7 @@
         <w:rPr>
           <w:lang w:val="pt_PT" w:bidi="pt_PT"/>
         </w:rPr>
-        <w:t xml:space="preserve"> Aceitem o que é fraco na fé, sem discutir sobre opiniões diferentes.</w:t>
+        <w:t xml:space="preserve"> Aceitem quem tem a fé mais fraca, sem entrar em discussões sobre opiniões.</w:t>
       </w:r>
     </w:p>
     <w:p>
@@ -7793,7 +7793,7 @@
         <w:rPr>
           <w:lang w:val="pt_PT" w:bidi="pt_PT"/>
         </w:rPr>
-        <w:t xml:space="preserve"> Um crê que pode comer de tudo; já quem é fraco come apenas certos alimentos.</w:t>
+        <w:t xml:space="preserve"> Um acredita que pode comer de tudo, enquanto o outro, por ter fé fraca, come somente certos alimentos.</w:t>
       </w:r>
     </w:p>
     <w:p>
@@ -7835,7 +7835,7 @@
         <w:rPr>
           <w:lang w:val="pt_PT" w:bidi="pt_PT"/>
         </w:rPr>
-        <w:t xml:space="preserve"> Quem é você para julgar o servo de outro? Ele está em pé ou cai diante de seu próprio senhor; mas permanecerá firme, porque o Senhor é poderoso para mantê-lo em pé.</w:t>
+        <w:t xml:space="preserve"> Quem é você para julgar o servo de outra pessoa? É diante do próprio senhor que ele permanece firme ou cai. E ele ficará firme, porque o Senhor tem poder para sustentá-lo.</w:t>
       </w:r>
     </w:p>
     <w:p>
@@ -7856,7 +7856,7 @@
         <w:rPr>
           <w:lang w:val="pt_PT" w:bidi="pt_PT"/>
         </w:rPr>
-        <w:t xml:space="preserve"> Um considera um dia mais importante que outro dia; outro, porém, considera todos os dias iguais; que cada um esteja plenamente convencido em sua própria mente.</w:t>
+        <w:t xml:space="preserve"> Há quem considere um dia mais importante do que outro, enquanto outros veem todos os dias da mesma forma. Cada pessoa deve estar segura em sua própria consciência.</w:t>
       </w:r>
     </w:p>
     <w:p>
@@ -7877,7 +7877,7 @@
         <w:rPr>
           <w:lang w:val="pt_PT" w:bidi="pt_PT"/>
         </w:rPr>
-        <w:t xml:space="preserve"> Quem considera o dia, considera-o para o Senhor; e quem come, come para o Senhor, porque dá graças a Deus; e quem não come, não come para o Senhor, e dá graças a Deus.</w:t>
+        <w:t xml:space="preserve"> Quem dá importância a um certo dia faz isso para o Senhor. Quem come, come para o Senhor, porque agradece a Deus; e quem deixa de comer também faz isso para o Senhor e igualmente dá graças a Deus.</w:t>
       </w:r>
     </w:p>
     <w:p>
@@ -7940,7 +7940,7 @@
         <w:rPr>
           <w:lang w:val="pt_PT" w:bidi="pt_PT"/>
         </w:rPr>
-        <w:t xml:space="preserve"> Para isso Cristo morreu e tornou a viver, para que fosse Senhor tanto dos mortos como dos vivos.</w:t>
+        <w:t xml:space="preserve"> Foi para isso que Cristo morreu e voltou à vida: para ser Senhor tanto dos mortos como dos vivos.</w:t>
       </w:r>
     </w:p>
     <w:p>
@@ -7961,7 +7961,7 @@
         <w:rPr>
           <w:lang w:val="pt_PT" w:bidi="pt_PT"/>
         </w:rPr>
-        <w:t xml:space="preserve"> E você, por que julga seu irmão? Ou você, por que despreza seu irmão? Pois todos nós compareceremos diante do tribunal de Deus;</w:t>
+        <w:t xml:space="preserve"> Então, por que você julga seu irmão? E por que despreza seu irmão? Todos nós estaremos diante do tribunal de Deus.</w:t>
       </w:r>
     </w:p>
     <w:p>
@@ -7982,7 +7982,7 @@
         <w:rPr>
           <w:lang w:val="pt_PT" w:bidi="pt_PT"/>
         </w:rPr>
-        <w:t xml:space="preserve"> pois está escrito: "Por minha vida, diz o Senhor, todo joelho se dobrará a mim e toda língua confessará a Deus".</w:t>
+        <w:t xml:space="preserve"> Porque está escrito: "Tão certo como eu vivo, diz o Senhor, todo joelho se dobrará diante de mim, e toda língua dará louvor a Deus".</w:t>
       </w:r>
     </w:p>
     <w:p>
@@ -8003,7 +8003,7 @@
         <w:rPr>
           <w:lang w:val="pt_PT" w:bidi="pt_PT"/>
         </w:rPr>
-        <w:t xml:space="preserve"> Assim, cada um de nós dará conta de si mesmo a Deus.</w:t>
+        <w:t xml:space="preserve"> Assim, cada um de nós prestará contas de si mesmo diante de Deus.</w:t>
       </w:r>
     </w:p>
     <w:p>
@@ -8024,7 +8024,7 @@
         <w:rPr>
           <w:lang w:val="pt_PT" w:bidi="pt_PT"/>
         </w:rPr>
-        <w:t xml:space="preserve"> Portanto, não julguemos mais uns aos outros. Pelo contrário, decidam isto: não ponham tropeço nem escândalo diante do irmão.</w:t>
+        <w:t xml:space="preserve"> Portanto, deixemos de julgar uns aos outros. Em vez disso, decidam não colocar nenhum obstáculo no caminho do irmão.</w:t>
       </w:r>
     </w:p>
     <w:p>
@@ -8045,7 +8045,7 @@
         <w:rPr>
           <w:lang w:val="pt_PT" w:bidi="pt_PT"/>
         </w:rPr>
-        <w:t xml:space="preserve"> Como alguém que está no Senhor Jesus, sei e estou convencido de que nada é impuro em si mesmo, mas, para quem pensa ser algo impuro, para esse é impuro.</w:t>
+        <w:t xml:space="preserve"> Como alguém unido ao Senhor Jesus, sei e estou convencido de que nada é impuro por si mesmo. Mas, se alguém considera alguma coisa impura, então para essa pessoa ela é impura.</w:t>
       </w:r>
     </w:p>
     <w:p>
@@ -8066,7 +8066,7 @@
         <w:rPr>
           <w:lang w:val="pt_PT" w:bidi="pt_PT"/>
         </w:rPr>
-        <w:t xml:space="preserve"> Se seu irmão se entristece por causa daquilo que você come, você já não está vivendo segundo o amor. Não destrua, por causa de sua comida, aquele por quem Cristo morreu.</w:t>
+        <w:t xml:space="preserve"> Se o seu irmão fica triste por causa daquilo que você come, você já não está agindo com amor. Não destrua, por causa da comida, alguém por quem Cristo morreu.</w:t>
       </w:r>
     </w:p>
     <w:p>
@@ -8087,7 +8087,7 @@
         <w:rPr>
           <w:lang w:val="pt_PT" w:bidi="pt_PT"/>
         </w:rPr>
-        <w:t xml:space="preserve"> Portanto, não seja difamado aquilo que é bom para vocês.</w:t>
+        <w:t xml:space="preserve"> Portanto, não permitam que aquilo que vocês consideram bom seja motivo de ofensa.</w:t>
       </w:r>
     </w:p>
     <w:p>
@@ -8108,7 +8108,7 @@
         <w:rPr>
           <w:lang w:val="pt_PT" w:bidi="pt_PT"/>
         </w:rPr>
-        <w:t xml:space="preserve"> Porque o reino de Deus não é comer, nem beber, mas justiça, paz e alegria no Espírito Santo.</w:t>
+        <w:t xml:space="preserve"> Porque o reino de Deus não se resume à comida e bebida, mas consiste em justiça, paz e alegria no Espírito Santo.</w:t>
       </w:r>
     </w:p>
     <w:p>
@@ -8129,7 +8129,7 @@
         <w:rPr>
           <w:lang w:val="pt_PT" w:bidi="pt_PT"/>
         </w:rPr>
-        <w:t xml:space="preserve"> Quem, nessas coisas, serve a Cristo agrada a Deus e é aprovado pelos homens.</w:t>
+        <w:t xml:space="preserve"> Quem serve a Cristo dessa maneira agrada a Deus e recebe aprovação das pessoas.</w:t>
       </w:r>
     </w:p>
     <w:p>
@@ -8150,7 +8150,7 @@
         <w:rPr>
           <w:lang w:val="pt_PT" w:bidi="pt_PT"/>
         </w:rPr>
-        <w:t xml:space="preserve"> Portanto, busquemos as coisas que promovem a paz e a edificação mútua.</w:t>
+        <w:t xml:space="preserve"> Assim, procuremos aquilo que promove a paz e fortalece uns aos outros.</w:t>
       </w:r>
     </w:p>
     <w:p>
@@ -8171,7 +8171,7 @@
         <w:rPr>
           <w:lang w:val="pt_PT" w:bidi="pt_PT"/>
         </w:rPr>
-        <w:t xml:space="preserve"> Não destrua a obra de Deus por causa da comida. Tudo é puro, mas não é bom para quem come com escândalo.</w:t>
+        <w:t xml:space="preserve"> Não destrua a obra de Deus por causa da comida. De fato, tudo é puro, mas é errado comer algo quando isso leva outra pessoa a tropeçar.</w:t>
       </w:r>
     </w:p>
     <w:p>
@@ -8192,7 +8192,7 @@
         <w:rPr>
           <w:lang w:val="pt_PT" w:bidi="pt_PT"/>
         </w:rPr>
-        <w:t xml:space="preserve"> É bom não comer carne nem beber vinho, nem fazer qualquer coisa que faça seu irmão tropeçar.</w:t>
+        <w:t xml:space="preserve"> É melhor não comer carne, nem beber vinho, nem fazer nada que leve seu irmão a cair.</w:t>
       </w:r>
     </w:p>
     <w:p>
@@ -8213,7 +8213,7 @@
         <w:rPr>
           <w:lang w:val="pt_PT" w:bidi="pt_PT"/>
         </w:rPr>
-        <w:t xml:space="preserve"> Guarde a fé que você tem para si mesmo diante de Deus. Bem-aventurado é aquele que não se condena naquilo que aprova.</w:t>
+        <w:t xml:space="preserve"> Mantenha entre você e Deus a convicção que você tem sobre essas coisas. Feliz é quem não se condena naquilo que considera correto.</w:t>
       </w:r>
     </w:p>
     <w:p>
@@ -8234,7 +8234,7 @@
         <w:rPr>
           <w:lang w:val="pt_PT" w:bidi="pt_PT"/>
         </w:rPr>
-        <w:t xml:space="preserve"> Mas aquele que tem dúvida já está condenado se comer, porque o que faz não provém da fé; e tudo o que não provém da fé é pecado.</w:t>
+        <w:t xml:space="preserve"> Mas quem tem dúvida e mesmo assim come fica condenado pela própria consciência, porque não age com fé. E tudo o que não vem da fé é pecado.</w:t>
       </w:r>
     </w:p>
     <w:p>
@@ -8271,7 +8271,7 @@
         <w:rPr>
           <w:lang w:val="pt_PT" w:bidi="pt_PT"/>
         </w:rPr>
-        <w:t xml:space="preserve"> Nós, que somos fortes na fé, devemos suportar as fraquezas dos fracos e não devemos agradar a nós mesmos.</w:t>
+        <w:t xml:space="preserve"> Nós, que somos fortes, devemos suportar as fraquezas dos que são fracos e não buscar agradar a nós mesmos.</w:t>
       </w:r>
     </w:p>
     <w:p>
@@ -8292,7 +8292,7 @@
         <w:rPr>
           <w:lang w:val="pt_PT" w:bidi="pt_PT"/>
         </w:rPr>
-        <w:t xml:space="preserve"> Cada um de nós deve agradar ao próximo para o bem dele, com o intuito de edificá-lo.</w:t>
+        <w:t xml:space="preserve"> Cada um de nós deve agradar ao próximo para o bem dele, ajudando-o a crescer.</w:t>
       </w:r>
     </w:p>
     <w:p>
@@ -8334,7 +8334,7 @@
         <w:rPr>
           <w:lang w:val="pt_PT" w:bidi="pt_PT"/>
         </w:rPr>
-        <w:t xml:space="preserve"> Porque tudo o que foi escrito no passado, foi escrito para nos ensinar, para que, pela paciência e consolação que vêm das Escrituras, tenhamos esperança.</w:t>
+        <w:t xml:space="preserve"> Tudo o que foi registrado antigamente serviu para nosso ensino, para que, por meio da perseverança e do encorajamento das Escrituras, tenhamos esperança.</w:t>
       </w:r>
     </w:p>
     <w:p>
@@ -8355,7 +8355,7 @@
         <w:rPr>
           <w:lang w:val="pt_PT" w:bidi="pt_PT"/>
         </w:rPr>
-        <w:t xml:space="preserve"> Ora, que Deus, que é quem dá paciência e consolação, lhes conceda o mesmo sentimento uns para com os outros, segundo Cristo Jesus,</w:t>
+        <w:t xml:space="preserve"> Que o Deus que dá perseverança e encorajamento conceda a vocês viver em harmonia uns com os outros, seguindo o exemplo de Cristo Jesus,</w:t>
       </w:r>
     </w:p>
     <w:p>
@@ -8376,7 +8376,7 @@
         <w:rPr>
           <w:lang w:val="pt_PT" w:bidi="pt_PT"/>
         </w:rPr>
-        <w:t xml:space="preserve"> para que, unânimes e a uma só voz, vocês glorifiquem o Deus e Pai de nosso Senhor Jesus Cristo.</w:t>
+        <w:t xml:space="preserve"> para que todos juntos, em unidade, glorifiquem o Deus e Pai de nosso Senhor Jesus Cristo.</w:t>
       </w:r>
     </w:p>
     <w:p>
@@ -8397,7 +8397,7 @@
         <w:rPr>
           <w:lang w:val="pt_PT" w:bidi="pt_PT"/>
         </w:rPr>
-        <w:t xml:space="preserve"> Portanto, acolham uns aos outros, assim como Cristo os acolheu para a glória de Deus.</w:t>
+        <w:t xml:space="preserve"> Por isso, recebam uns aos outros, assim como Cristo também recebeu vocês, para a glória de Deus.</w:t>
       </w:r>
     </w:p>
     <w:p>
@@ -8418,7 +8418,7 @@
         <w:rPr>
           <w:lang w:val="pt_PT" w:bidi="pt_PT"/>
         </w:rPr>
-        <w:t xml:space="preserve"> Digo, pois, que Cristo tornou-se ministro da circuncisão, por amor à verdade de Deus, para confirmar as promessas feitas aos patriarcas;</w:t>
+        <w:t xml:space="preserve"> Pois digo que Cristo se tornou servo dos judeus por causa da verdade de Deus, para confirmar as promessas feitas aos patriarcas;</w:t>
       </w:r>
     </w:p>
     <w:p>
@@ -8439,7 +8439,7 @@
         <w:rPr>
           <w:lang w:val="pt_PT" w:bidi="pt_PT"/>
         </w:rPr>
-        <w:t xml:space="preserve"> e para que os gentios glorifiquem a Deus por sua misericórdia, como está escrito: "Por isso, eu te louvarei entre os gentios e cantarei ao teu nome".</w:t>
+        <w:t xml:space="preserve"> e também para que os gentios glorifiquem a Deus por sua misericórdia, como está escrito: "Por isso eu te louvarei entre as nações e cantarei louvores ao teu nome".</w:t>
       </w:r>
     </w:p>
     <w:p>
@@ -8460,7 +8460,7 @@
         <w:rPr>
           <w:lang w:val="pt_PT" w:bidi="pt_PT"/>
         </w:rPr>
-        <w:t xml:space="preserve"> E novamente diz a Escritura: "Alegrem-se, ó gentios, com seu povo".</w:t>
+        <w:t xml:space="preserve"> E em outro lugar está escrito: "Alegrem-se, nações, junto com o povo dele".</w:t>
       </w:r>
     </w:p>
     <w:p>
@@ -8481,7 +8481,7 @@
         <w:rPr>
           <w:lang w:val="pt_PT" w:bidi="pt_PT"/>
         </w:rPr>
-        <w:t xml:space="preserve"> E ainda: "Louvem ao Senhor, todos vocês, gentios, e todos os povos cantem louvores a ele".</w:t>
+        <w:t xml:space="preserve"> E ainda: "Louvem o Senhor, todas as nações, e todos os povos o exaltem".</w:t>
       </w:r>
     </w:p>
     <w:p>
@@ -8502,7 +8502,7 @@
         <w:rPr>
           <w:lang w:val="pt_PT" w:bidi="pt_PT"/>
         </w:rPr>
-        <w:t xml:space="preserve"> Isaías também diz: "Virá o rebento de Jessé, e naquele que se levantará para governar os gentios, eles colocarão sua esperança".</w:t>
+        <w:t xml:space="preserve"> Isaías também diz: "Virá a raiz de Jessé, aquele que se levantará para governar as nações; nele os gentios colocarão sua esperança".</w:t>
       </w:r>
     </w:p>
     <w:p>
@@ -8523,7 +8523,7 @@
         <w:rPr>
           <w:lang w:val="pt_PT" w:bidi="pt_PT"/>
         </w:rPr>
-        <w:t xml:space="preserve"> Que o Deus da esperança os encha de toda alegria e paz em sua fé, para que vocês transbordem de esperança pelo poder do Espírito Santo.</w:t>
+        <w:t xml:space="preserve"> Que o Deus da esperança encha vocês de toda alegria e paz enquanto confiam nele, para que transbordem de esperança pelo poder do Espírito Santo.</w:t>
       </w:r>
     </w:p>
     <w:p>
@@ -8544,7 +8544,7 @@
         <w:rPr>
           <w:lang w:val="pt_PT" w:bidi="pt_PT"/>
         </w:rPr>
-        <w:t xml:space="preserve"> Eu mesmo, meus irmãos, estou convencido de que vocês mesmos estão cheios de bondade, têm todo o conhecimento e são capazes de admoestar uns aos outros.</w:t>
+        <w:t xml:space="preserve"> Meus irmãos, eu mesmo estou convencido de que vocês estão cheios de bondade, possuem conhecimento e são capazes de orientar uns aos outros.</w:t>
       </w:r>
     </w:p>
     <w:p>
@@ -8565,7 +8565,7 @@
         <w:rPr>
           <w:lang w:val="pt_PT" w:bidi="pt_PT"/>
         </w:rPr>
-        <w:t xml:space="preserve"> Eu lhes escrevi, em parte com mais ousadia, para fazê-los se lembrar disto outra vez, por causa da graça que Deus me concedeu;</w:t>
+        <w:t xml:space="preserve"> Eu lhes escrevi, em parte com mais ousadia, para fazê-los lembrar disto outra vez, por causa da graça que Deus me concedeu;</w:t>
       </w:r>
     </w:p>
     <w:p>
@@ -8586,7 +8586,7 @@
         <w:rPr>
           <w:lang w:val="pt_PT" w:bidi="pt_PT"/>
         </w:rPr>
-        <w:t xml:space="preserve"> que eu seja ministro de Cristo Jesus para os gentios, anunciando como sacerdote o evangelho de Deus, para que a oferta deles seja aceitável, santificada pelo Espírito Santo.</w:t>
+        <w:t xml:space="preserve"> para ser ministro de Cristo Jesus entre os gentios, servindo como sacerdote do evangelho de Deus, a fim de que os gentios sejam uma oferta aceitável, santificada pelo Espírito Santo.</w:t>
       </w:r>
     </w:p>
     <w:p>
@@ -8607,7 +8607,7 @@
         <w:rPr>
           <w:lang w:val="pt_PT" w:bidi="pt_PT"/>
         </w:rPr>
-        <w:t xml:space="preserve"> Portanto, eu me glorio em Cristo Jesus nas coisas concernentes a Deus.</w:t>
+        <w:t xml:space="preserve"> Assim, em Cristo Jesus, tenho motivo para me alegrar no serviço que presto a Deus.</w:t>
       </w:r>
     </w:p>
     <w:p>
@@ -8649,7 +8649,7 @@
         <w:rPr>
           <w:lang w:val="pt_PT" w:bidi="pt_PT"/>
         </w:rPr>
-        <w:t xml:space="preserve"> pelo poder de sinais e maravilhas, e pelo poder do Espírito de Deus; de modo que, desde Jerusalém e arredores até o Ilírico, tenho pregado o evangelho de Cristo,</w:t>
+        <w:t xml:space="preserve"> pelo poder de sinais e maravilhas e pelo poder do Espírito de Deus. Assim, desde Jerusalém e por todas as regiões ao redor até o Ilírico, anunciei plenamente o evangelho de Cristo.</w:t>
       </w:r>
     </w:p>
     <w:p>
@@ -8670,7 +8670,7 @@
         <w:rPr>
           <w:lang w:val="pt_PT" w:bidi="pt_PT"/>
         </w:rPr>
-        <w:t xml:space="preserve"> esforçando-me, desta maneira, por anunciar o evangelho onde Cristo ainda não havia sido anunciado, para não edificar sobre fundamento alheio;</w:t>
+        <w:t xml:space="preserve"> Desse modo, procurei anunciar o evangelho onde Cristo ainda não era conhecido, para não construir sobre o trabalho de outra pessoa.</w:t>
       </w:r>
     </w:p>
     <w:p>
@@ -8691,7 +8691,7 @@
         <w:rPr>
           <w:lang w:val="pt_PT" w:bidi="pt_PT"/>
         </w:rPr>
-        <w:t xml:space="preserve"> mas, como está escrito: "Hão de vê-lo aqueles a quem ele não havia sido anunciado, e de entendê-lo os que não haviam ouvido a seu respeito".</w:t>
+        <w:t xml:space="preserve"> Como está escrito: "Verão aquele sobre quem nada lhes foi anunciado, e entenderão aqueles que nunca ouviram falar dele".</w:t>
       </w:r>
     </w:p>
     <w:p>
@@ -8733,7 +8733,7 @@
         <w:rPr>
           <w:lang w:val="pt_PT" w:bidi="pt_PT"/>
         </w:rPr>
-        <w:t xml:space="preserve"> Mas agora, não tendo mais lugar nestas regiões onde eu precise trabalhar e desejando há muito vê-los,</w:t>
+        <w:t xml:space="preserve"> Mas agora, não tendo mais campo de trabalho nessas regiões e desejando há muitos anos visitar vocês,</w:t>
       </w:r>
     </w:p>
     <w:p>
@@ -8754,7 +8754,7 @@
         <w:rPr>
           <w:lang w:val="pt_PT" w:bidi="pt_PT"/>
         </w:rPr>
-        <w:t xml:space="preserve"> planejo fazê-lo quando for à Espanha. Espero visitá-los de passagem e ser enviado para lá por vocês, depois de ter desfrutado um pouco de sua companhia.</w:t>
+        <w:t xml:space="preserve"> pretendo vê-los quando for para a Espanha. Espero visitá-los de passagem e receber ajuda de vocês para seguir viagem, depois de aproveitar um pouco a companhia de vocês.</w:t>
       </w:r>
     </w:p>
     <w:p>
@@ -8817,7 +8817,7 @@
         <w:rPr>
           <w:lang w:val="pt_PT" w:bidi="pt_PT"/>
         </w:rPr>
-        <w:t xml:space="preserve"> Isso lhes pareceu bem, uma vez que são devedores aos santos de Jerusalém; pois, se os gentios participaram das bênçãos espirituais deles, devem também lhes servir com as coisas materiais.</w:t>
+        <w:t xml:space="preserve"> Isso lhes pareceu certo, e de fato eles têm essa dívida para com os santos de Jerusalém. Pois, se os gentios participaram das bênçãos espirituais dos judeus, também devem ajudá-los com seus bens materiais.</w:t>
       </w:r>
     </w:p>
     <w:p>
@@ -8838,7 +8838,7 @@
         <w:rPr>
           <w:lang w:val="pt_PT" w:bidi="pt_PT"/>
         </w:rPr>
-        <w:t xml:space="preserve"> Assim, depois de concluir isto e de lhes entregar este fruto, irei à Espanha e, no caminho, irei visitá-los.</w:t>
+        <w:t xml:space="preserve"> Depois de concluir essa tarefa e entregar oficialmente essa contribuição, partirei para a Espanha e visitarei vocês no caminho.</w:t>
       </w:r>
     </w:p>
     <w:p>
@@ -8859,7 +8859,7 @@
         <w:rPr>
           <w:lang w:val="pt_PT" w:bidi="pt_PT"/>
         </w:rPr>
-        <w:t xml:space="preserve"> E sei que, quando for até vocês, irei na plenitude da bênção de Cristo.</w:t>
+        <w:t xml:space="preserve"> E sei que, quando eu for visitá-los, chegarei com a plena bênção de Cristo.</w:t>
       </w:r>
     </w:p>
     <w:p>
@@ -8880,7 +8880,7 @@
         <w:rPr>
           <w:lang w:val="pt_PT" w:bidi="pt_PT"/>
         </w:rPr>
-        <w:t xml:space="preserve"> Peço, irmãos, por nosso Senhor Jesus Cristo e pelo amor do Espírito, que lutem comigo em suas orações a Deus por mim,</w:t>
+        <w:t xml:space="preserve"> Irmãos, peço a vocês, por nosso Senhor Jesus Cristo e pelo amor do Espírito, que se unam a mim em oração diante de Deus por minha causa,</w:t>
       </w:r>
     </w:p>
     <w:p>
@@ -8901,7 +8901,7 @@
         <w:rPr>
           <w:lang w:val="pt_PT" w:bidi="pt_PT"/>
         </w:rPr>
-        <w:t xml:space="preserve"> para que eu esteja livre dos rebeldes na Judeia, e meu serviço em Jerusalém seja aceito pelos santos,</w:t>
+        <w:t xml:space="preserve"> para que eu seja livre daqueles que rejeitam a fé na Judeia e para que meu serviço em Jerusalém seja bem recebido pelos santos,</w:t>
       </w:r>
     </w:p>
     <w:p>
@@ -8922,7 +8922,7 @@
         <w:rPr>
           <w:lang w:val="pt_PT" w:bidi="pt_PT"/>
         </w:rPr>
-        <w:t xml:space="preserve"> a fim de que, pela vontade de Deus, eu possa visitá-los com alegria e, junto com vocês, possa ter algum descanso em sua companhia.</w:t>
+        <w:t xml:space="preserve"> assim, pela vontade de Deus, eu possa visitá-los com alegria e encontrar descanso junto com vocês.</w:t>
       </w:r>
     </w:p>
     <w:p>
@@ -8980,7 +8980,7 @@
         <w:rPr>
           <w:lang w:val="pt_PT" w:bidi="pt_PT"/>
         </w:rPr>
-        <w:t xml:space="preserve"> Recomendo a vocês nossa irmã Febe, que está servindo na igreja em Cencreia,</w:t>
+        <w:t xml:space="preserve"> Recomendo a vocês nossa irmã Febe, serva da igreja em Cencreia.</w:t>
       </w:r>
     </w:p>
     <w:p>
@@ -9001,7 +9001,7 @@
         <w:rPr>
           <w:lang w:val="pt_PT" w:bidi="pt_PT"/>
         </w:rPr>
-        <w:t xml:space="preserve"> para que a recebam no Senhor, de modo digno dos santos, e a ajudem em tudo o que ela precisar de vocês, pois tem ajudado a muitos, inclusive a mim.</w:t>
+        <w:t xml:space="preserve"> Recebam-na no Senhor de maneira digna do povo santo e deem a ela toda ajuda necessária, porque ela tem apoiado muitas pessoas, inclusive a mim.</w:t>
       </w:r>
     </w:p>
     <w:p>
@@ -9043,7 +9043,7 @@
         <w:rPr>
           <w:lang w:val="pt_PT" w:bidi="pt_PT"/>
         </w:rPr>
-        <w:t xml:space="preserve"> Eles arriscaram a própria cabeça por mim; e isso lhes agradeço, não só eu, mas também todas as igrejas dos gentios.</w:t>
+        <w:t xml:space="preserve"> Eles colocaram a própria vida em risco por mim. Sou grato a eles, e não somente eu, mas também todas as igrejas dos gentios.</w:t>
       </w:r>
     </w:p>
     <w:p>
@@ -9064,7 +9064,7 @@
         <w:rPr>
           <w:lang w:val="pt_PT" w:bidi="pt_PT"/>
         </w:rPr>
-        <w:t xml:space="preserve"> Saudações também à igreja que se reúne na casa deles. Saudações ao meu amado Epêneto, que foi o primeiro a se converter a Cristo na província da Ásia.Há uma pequena diferença entre os manuscritos. O latim diz "Achaiae" (Acaia)." class="footnote-marker"&gt;1</w:t>
+        <w:t xml:space="preserve"> Saudações também à igreja que se reúne na casa deles. Saudações ao meu amado Epêneto, que foi o primeiro fruto para Cristo na província da Ásia.1</w:t>
       </w:r>
     </w:p>
     <w:p>
@@ -9106,7 +9106,7 @@
         <w:rPr>
           <w:lang w:val="pt_PT" w:bidi="pt_PT"/>
         </w:rPr>
-        <w:t xml:space="preserve"> Saudações a Andrônico e a Júnias, meus parentes e companheiros de prisão; eles são bem conhecidos entre os apóstolos e estavam em Cristo antes de mim.</w:t>
+        <w:t xml:space="preserve"> Saudações a Andrônico e Júnias, meus parentes e companheiros de prisão. Eles são muito estimados entre os apóstolos e estavam em Cristo antes de mim.</w:t>
       </w:r>
     </w:p>
     <w:p>
@@ -9169,7 +9169,7 @@
         <w:rPr>
           <w:lang w:val="pt_PT" w:bidi="pt_PT"/>
         </w:rPr>
-        <w:t xml:space="preserve"> Saudações a Apeles, aprovado em Cristo. Saudações aos da casa de Aristóbulo.</w:t>
+        <w:t xml:space="preserve"> Saudações a Apeles, aprovado em Cristo. Saudações aos que pertencem à casa de Aristóbulo.</w:t>
       </w:r>
     </w:p>
     <w:p>
@@ -9211,7 +9211,7 @@
         <w:rPr>
           <w:lang w:val="pt_PT" w:bidi="pt_PT"/>
         </w:rPr>
-        <w:t xml:space="preserve"> Saudações a Trifena e Trifosa, que trabalham arduamente no Senhor; e à amada Pérside, que trabalhou muito no Senhor.</w:t>
+        <w:t xml:space="preserve"> Saudações a Trifena e Trifosa, que se dedicam ao trabalho no Senhor, e à amada Pérside, que trabalhou muito no Senhor.</w:t>
       </w:r>
     </w:p>
     <w:p>
@@ -9232,7 +9232,7 @@
         <w:rPr>
           <w:lang w:val="pt_PT" w:bidi="pt_PT"/>
         </w:rPr>
-        <w:t xml:space="preserve"> Saudações a Rufo, eleito no Senhor, e à sua mãe, que também tem sido mãe para mim.</w:t>
+        <w:t xml:space="preserve"> Saudações a Rufo, escolhido no Senhor, e à mãe dele, que também tem sido como mãe para mim.</w:t>
       </w:r>
     </w:p>
     <w:p>
@@ -9295,7 +9295,7 @@
         <w:rPr>
           <w:lang w:val="pt_PT" w:bidi="pt_PT"/>
         </w:rPr>
-        <w:t xml:space="preserve"> Saúdem uns aos outros com um beijo santo. Todas as igrejas de Cristo enviam saudações a vocês.</w:t>
+        <w:t xml:space="preserve"> Cumprimentem uns aos outros com beijo santo. Todas as igrejas de Cristo enviam saudações.</w:t>
       </w:r>
     </w:p>
     <w:p>
@@ -9316,7 +9316,7 @@
         <w:rPr>
           <w:lang w:val="pt_PT" w:bidi="pt_PT"/>
         </w:rPr>
-        <w:t xml:space="preserve"> Irmãos, peço que notem aqueles que causam dissensões e escândalos contra o ensinamento que vocês aprenderam. Afastem-se deles,</w:t>
+        <w:t xml:space="preserve"> Irmãos, peço que tenham cuidado com aqueles que provocam divisões e colocam obstáculos contra o ensino que vocês receberam. Afastem-se deles.</w:t>
       </w:r>
     </w:p>
     <w:p>
@@ -9337,7 +9337,7 @@
         <w:rPr>
           <w:lang w:val="pt_PT" w:bidi="pt_PT"/>
         </w:rPr>
-        <w:t xml:space="preserve"> pois tais pessoas não servem ao nosso Senhor Jesus Cristo, e sim aos seus próprios desejos. Por meio de palavras doces e bajulação, enganam o coração dos ingênuos.</w:t>
+        <w:t xml:space="preserve"> Porque essas pessoas não servem ao nosso Senhor Cristo, mas aos próprios apetites. Com palavras suaves e elogios exagerados, enganam o coração dos inocentes.</w:t>
       </w:r>
     </w:p>
     <w:p>
@@ -9358,7 +9358,7 @@
         <w:rPr>
           <w:lang w:val="pt_PT" w:bidi="pt_PT"/>
         </w:rPr>
-        <w:t xml:space="preserve"> Todos sabem da obediência de vocês; por isso, me alegro. Mas quero que sejam sábios quanto ao que é bom e puros quanto ao que é mau.</w:t>
+        <w:t xml:space="preserve"> A obediência de vocês é conhecida por todos, e isso me alegra. Quero, porém, que sejam sábios para o bem e inocentes em relação ao mal.</w:t>
       </w:r>
     </w:p>
     <w:p>
@@ -9379,7 +9379,7 @@
         <w:rPr>
           <w:lang w:val="pt_PT" w:bidi="pt_PT"/>
         </w:rPr>
-        <w:t xml:space="preserve"> O Deus da paz esmagará em breve Satanás debaixo dos pés de vocês. Que a graça de nosso Senhor Jesus Cristo esteja com vocês.</w:t>
+        <w:t xml:space="preserve"> E o Deus da paz logo esmagará Satanás debaixo dos pés de vocês. Que a graça de nosso Senhor Jesus esteja com vocês.</w:t>
       </w:r>
     </w:p>
     <w:p>
@@ -9400,7 +9400,7 @@
         <w:rPr>
           <w:lang w:val="pt_PT" w:bidi="pt_PT"/>
         </w:rPr>
-        <w:t xml:space="preserve"> Timóteo, meu companheiro de trabalho, e Lúcio, Jasom e Sosípatro, meus parentes, enviam saudações a vocês.</w:t>
+        <w:t xml:space="preserve"> Timóteo, meu cooperador, e também Lúcio, Jasom e Sosípatro, meus parentes, enviam saudações.</w:t>
       </w:r>
     </w:p>
     <w:p>
@@ -9442,7 +9442,7 @@
         <w:rPr>
           <w:lang w:val="pt_PT" w:bidi="pt_PT"/>
         </w:rPr>
-        <w:t xml:space="preserve"> Gaio, na casa de quem a igreja daqui e eu nos reunimos, envia saudações a vocês. Erasto, o tesoureiro da cidade, e o irmão Quarto enviam saudações a vocês.</w:t>
+        <w:t xml:space="preserve"> Gaio, que hospeda a mim e toda a igreja, envia saudações. Erasto, administrador da cidade, e o irmão Quarto também enviam saudações.</w:t>
       </w:r>
     </w:p>
     <w:p>
@@ -9463,7 +9463,7 @@
         <w:rPr>
           <w:lang w:val="pt_PT" w:bidi="pt_PT"/>
         </w:rPr>
-        <w:t xml:space="preserve"> [Que a graça de nosso Senhor Jesus Cristo esteja com todos vocês. Amém.]Muitos manuscritos não incluem este versículo." class="footnote-marker"&gt;2</w:t>
+        <w:t xml:space="preserve"> [Que a graça de nosso Senhor Jesus Cristo esteja com todos vocês. Amém.]2</w:t>
       </w:r>
     </w:p>
     <w:sectPr>

</xml_diff>